<commit_message>
chore(_BUILD): regenerate HOW-TO-START.docx with §1.5/§3.5/§4/§10 fixes
Co-Authored-By: Claude Opus 4.7 (1M context) <noreply@anthropic.com>
</commit_message>
<xml_diff>
--- a/_BUILD/HOW-TO-START.docx
+++ b/_BUILD/HOW-TO-START.docx
@@ -36,7 +36,7 @@
         </w:p>
       </w:sdtContent>
     </w:sdt>
-    <w:bookmarkStart w:id="42" w:name="как-начинать-новый-сайт"/>
+    <w:bookmarkStart w:id="50" w:name="как-начинать-новый-сайт"/>
     <w:p>
       <w:pPr>
         <w:pStyle w:val="Heading1"/>
@@ -2393,13 +2393,13 @@
       </w:r>
     </w:p>
     <w:bookmarkEnd w:id="20"/>
-    <w:bookmarkStart w:id="21" w:name="Xa43027c13f65adccfdcefb6941badb6f1862b37"/>
+    <w:bookmarkStart w:id="21" w:name="X1d4c4bcecfce19b45efd909d7bad35283999fb7"/>
     <w:p>
       <w:pPr>
         <w:pStyle w:val="Heading2"/>
       </w:pPr>
       <w:r>
-        <w:t xml:space="preserve">1.5. Клонировать существующий проект (новый Mac, или второй компьютер)</w:t>
+        <w:t xml:space="preserve">1.5. Клонировать СВОЙ существующий проект (новый Mac / второй компьютер владельца)</w:t>
       </w:r>
     </w:p>
     <w:p>
@@ -2407,170 +2407,229 @@
         <w:pStyle w:val="FirstParagraph"/>
       </w:pPr>
       <w:r>
-        <w:t xml:space="preserve">Если сайт уже есть на GitHub (твой или у работодателя) и ты хочешь поднять его на новой машине — это другой поток, не §1. Прошёл §0 (Mac готов), теперь:</w:t>
-      </w:r>
-    </w:p>
-    <w:p>
-      <w:pPr>
-        <w:pStyle w:val="SourceCode"/>
-      </w:pPr>
-      <w:r>
-        <w:rPr>
-          <w:rStyle w:val="BuiltInTok"/>
-        </w:rPr>
-        <w:t xml:space="preserve">cd</w:t>
-      </w:r>
-      <w:r>
-        <w:rPr>
-          <w:rStyle w:val="NormalTok"/>
-        </w:rPr>
-        <w:t xml:space="preserve"> ~/projects</w:t>
-      </w:r>
-      <w:r>
-        <w:br/>
-      </w:r>
-      <w:r>
-        <w:rPr>
-          <w:rStyle w:val="ExtensionTok"/>
-        </w:rPr>
-        <w:t xml:space="preserve">gh</w:t>
-      </w:r>
-      <w:r>
-        <w:rPr>
-          <w:rStyle w:val="NormalTok"/>
-        </w:rPr>
-        <w:t xml:space="preserve"> repo clone </w:t>
-      </w:r>
-      <w:r>
-        <w:rPr>
-          <w:rStyle w:val="OperatorTok"/>
-        </w:rPr>
-        <w:t xml:space="preserve">&lt;</w:t>
-      </w:r>
-      <w:r>
-        <w:rPr>
-          <w:rStyle w:val="NormalTok"/>
-        </w:rPr>
-        <w:t xml:space="preserve">owner</w:t>
-      </w:r>
-      <w:r>
-        <w:rPr>
-          <w:rStyle w:val="OperatorTok"/>
-        </w:rPr>
-        <w:t xml:space="preserve">&gt;</w:t>
-      </w:r>
-      <w:r>
-        <w:rPr>
-          <w:rStyle w:val="NormalTok"/>
-        </w:rPr>
-        <w:t xml:space="preserve">/{site}        </w:t>
-      </w:r>
-      <w:r>
-        <w:rPr>
-          <w:rStyle w:val="CommentTok"/>
-        </w:rPr>
-        <w:t xml:space="preserve"># owner — владелец репо, может совпадать с тобой</w:t>
-      </w:r>
-      <w:r>
-        <w:br/>
-      </w:r>
-      <w:r>
-        <w:rPr>
-          <w:rStyle w:val="BuiltInTok"/>
-        </w:rPr>
-        <w:t xml:space="preserve">cd</w:t>
-      </w:r>
-      <w:r>
-        <w:rPr>
-          <w:rStyle w:val="NormalTok"/>
-        </w:rPr>
-        <w:t xml:space="preserve"> {site}</w:t>
-      </w:r>
-      <w:r>
-        <w:br/>
-      </w:r>
-      <w:r>
-        <w:rPr>
-          <w:rStyle w:val="ExtensionTok"/>
-        </w:rPr>
-        <w:t xml:space="preserve">mise</w:t>
-      </w:r>
-      <w:r>
-        <w:rPr>
-          <w:rStyle w:val="NormalTok"/>
-        </w:rPr>
-        <w:t xml:space="preserve"> install                         </w:t>
-      </w:r>
-      <w:r>
-        <w:rPr>
-          <w:rStyle w:val="CommentTok"/>
-        </w:rPr>
-        <w:t xml:space="preserve"># подхватит версии из .tool-versions</w:t>
-      </w:r>
-      <w:r>
-        <w:br/>
-      </w:r>
-      <w:r>
-        <w:rPr>
-          <w:rStyle w:val="ExtensionTok"/>
-        </w:rPr>
-        <w:t xml:space="preserve">pnpm</w:t>
-      </w:r>
-      <w:r>
-        <w:rPr>
-          <w:rStyle w:val="NormalTok"/>
-        </w:rPr>
-        <w:t xml:space="preserve"> install                         </w:t>
-      </w:r>
-      <w:r>
-        <w:rPr>
-          <w:rStyle w:val="CommentTok"/>
-        </w:rPr>
-        <w:t xml:space="preserve"># установит зависимости из pnpm-lock.yaml</w:t>
-      </w:r>
-      <w:r>
-        <w:br/>
-      </w:r>
-      <w:r>
-        <w:rPr>
-          <w:rStyle w:val="ExtensionTok"/>
-        </w:rPr>
-        <w:t xml:space="preserve">pnpm</w:t>
-      </w:r>
-      <w:r>
-        <w:rPr>
-          <w:rStyle w:val="NormalTok"/>
-        </w:rPr>
-        <w:t xml:space="preserve"> dev                             </w:t>
-      </w:r>
-      <w:r>
-        <w:rPr>
-          <w:rStyle w:val="CommentTok"/>
-        </w:rPr>
-        <w:t xml:space="preserve"># → http://localhost:3000</w:t>
-      </w:r>
-    </w:p>
-    <w:p>
-      <w:pPr>
-        <w:pStyle w:val="FirstParagraph"/>
-      </w:pPr>
+        <w:t xml:space="preserve">Это сценарий:</w:t>
+      </w:r>
+      <w:r>
+        <w:t xml:space="preserve"> </w:t>
+      </w:r>
       <w:r>
         <w:rPr>
           <w:b/>
           <w:bCs/>
         </w:rPr>
+        <w:t xml:space="preserve">ты владелец сайта</w:t>
+      </w:r>
+      <w:r>
+        <w:t xml:space="preserve">, проект уже лежит на твоём GitHub-аккаунте, и ты хочешь поднять его на новой машине (купил новый Mac, или работаешь с двух — на работе и дома).</w:t>
+      </w:r>
+    </w:p>
+    <w:p>
+      <w:pPr>
+        <w:pStyle w:val="BlockText"/>
+      </w:pPr>
+      <w:r>
+        <w:t xml:space="preserve">⚠️</w:t>
+      </w:r>
+      <w:r>
+        <w:t xml:space="preserve"> </w:t>
+      </w:r>
+      <w:r>
+        <w:rPr>
+          <w:b/>
+          <w:bCs/>
+        </w:rPr>
+        <w:t xml:space="preserve">Если ты не владелец, а второй разработчик</w:t>
+      </w:r>
+      <w:r>
+        <w:t xml:space="preserve"> </w:t>
+      </w:r>
+      <w:r>
+        <w:t xml:space="preserve">(получил Invite от владельца) — этот раздел не для тебя. Тебе нужно: открыть</w:t>
+      </w:r>
+      <w:r>
+        <w:t xml:space="preserve"> </w:t>
+      </w:r>
+      <w:r>
+        <w:rPr>
+          <w:rStyle w:val="VerbatimChar"/>
+        </w:rPr>
+        <w:t xml:space="preserve">docs/team-onboarding.md</w:t>
+      </w:r>
+      <w:r>
+        <w:t xml:space="preserve"> </w:t>
+      </w:r>
+      <w:r>
+        <w:t xml:space="preserve">(полный гид с учётом твоих ограничений по доступу) + читать §7 ниже, где описан весь collaborator-флоу.</w:t>
+      </w:r>
+    </w:p>
+    <w:p>
+      <w:pPr>
+        <w:pStyle w:val="FirstParagraph"/>
+      </w:pPr>
+      <w:r>
+        <w:t xml:space="preserve">Прошёл §0 (Mac готов), теперь:</w:t>
+      </w:r>
+    </w:p>
+    <w:p>
+      <w:pPr>
+        <w:pStyle w:val="SourceCode"/>
+      </w:pPr>
+      <w:r>
+        <w:rPr>
+          <w:rStyle w:val="BuiltInTok"/>
+        </w:rPr>
+        <w:t xml:space="preserve">cd</w:t>
+      </w:r>
+      <w:r>
+        <w:rPr>
+          <w:rStyle w:val="NormalTok"/>
+        </w:rPr>
+        <w:t xml:space="preserve"> ~/projects</w:t>
+      </w:r>
+      <w:r>
+        <w:br/>
+      </w:r>
+      <w:r>
+        <w:rPr>
+          <w:rStyle w:val="ExtensionTok"/>
+        </w:rPr>
+        <w:t xml:space="preserve">gh</w:t>
+      </w:r>
+      <w:r>
+        <w:rPr>
+          <w:rStyle w:val="NormalTok"/>
+        </w:rPr>
+        <w:t xml:space="preserve"> repo clone </w:t>
+      </w:r>
+      <w:r>
+        <w:rPr>
+          <w:rStyle w:val="OperatorTok"/>
+        </w:rPr>
+        <w:t xml:space="preserve">&lt;</w:t>
+      </w:r>
+      <w:r>
+        <w:rPr>
+          <w:rStyle w:val="NormalTok"/>
+        </w:rPr>
+        <w:t xml:space="preserve">твой-логин</w:t>
+      </w:r>
+      <w:r>
+        <w:rPr>
+          <w:rStyle w:val="OperatorTok"/>
+        </w:rPr>
+        <w:t xml:space="preserve">&gt;</w:t>
+      </w:r>
+      <w:r>
+        <w:rPr>
+          <w:rStyle w:val="NormalTok"/>
+        </w:rPr>
+        <w:t xml:space="preserve">/{site}    </w:t>
+      </w:r>
+      <w:r>
+        <w:rPr>
+          <w:rStyle w:val="CommentTok"/>
+        </w:rPr>
+        <w:t xml:space="preserve"># тот же GitHub-аккаунт, что создал репо</w:t>
+      </w:r>
+      <w:r>
+        <w:br/>
+      </w:r>
+      <w:r>
+        <w:rPr>
+          <w:rStyle w:val="BuiltInTok"/>
+        </w:rPr>
+        <w:t xml:space="preserve">cd</w:t>
+      </w:r>
+      <w:r>
+        <w:rPr>
+          <w:rStyle w:val="NormalTok"/>
+        </w:rPr>
+        <w:t xml:space="preserve"> {site}</w:t>
+      </w:r>
+      <w:r>
+        <w:br/>
+      </w:r>
+      <w:r>
+        <w:rPr>
+          <w:rStyle w:val="ExtensionTok"/>
+        </w:rPr>
+        <w:t xml:space="preserve">mise</w:t>
+      </w:r>
+      <w:r>
+        <w:rPr>
+          <w:rStyle w:val="NormalTok"/>
+        </w:rPr>
+        <w:t xml:space="preserve"> install                          </w:t>
+      </w:r>
+      <w:r>
+        <w:rPr>
+          <w:rStyle w:val="CommentTok"/>
+        </w:rPr>
+        <w:t xml:space="preserve"># подхватит версии из .tool-versions</w:t>
+      </w:r>
+      <w:r>
+        <w:br/>
+      </w:r>
+      <w:r>
+        <w:rPr>
+          <w:rStyle w:val="ExtensionTok"/>
+        </w:rPr>
+        <w:t xml:space="preserve">pnpm</w:t>
+      </w:r>
+      <w:r>
+        <w:rPr>
+          <w:rStyle w:val="NormalTok"/>
+        </w:rPr>
+        <w:t xml:space="preserve"> install                          </w:t>
+      </w:r>
+      <w:r>
+        <w:rPr>
+          <w:rStyle w:val="CommentTok"/>
+        </w:rPr>
+        <w:t xml:space="preserve"># установит зависимости из pnpm-lock.yaml</w:t>
+      </w:r>
+      <w:r>
+        <w:br/>
+      </w:r>
+      <w:r>
+        <w:rPr>
+          <w:rStyle w:val="ExtensionTok"/>
+        </w:rPr>
+        <w:t xml:space="preserve">pnpm</w:t>
+      </w:r>
+      <w:r>
+        <w:rPr>
+          <w:rStyle w:val="NormalTok"/>
+        </w:rPr>
+        <w:t xml:space="preserve"> dev                              </w:t>
+      </w:r>
+      <w:r>
+        <w:rPr>
+          <w:rStyle w:val="CommentTok"/>
+        </w:rPr>
+        <w:t xml:space="preserve"># → http://localhost:3000</w:t>
+      </w:r>
+    </w:p>
+    <w:p>
+      <w:pPr>
+        <w:pStyle w:val="FirstParagraph"/>
+      </w:pPr>
+      <w:r>
+        <w:rPr>
+          <w:b/>
+          <w:bCs/>
+        </w:rPr>
         <w:t xml:space="preserve">Чего не приедет с git’а</w:t>
       </w:r>
       <w:r>
         <w:t xml:space="preserve"> </w:t>
       </w:r>
       <w:r>
-        <w:t xml:space="preserve">(и придётся достать отдельно, если нужно):</w:t>
-      </w:r>
-    </w:p>
-    <w:p>
-      <w:pPr>
-        <w:pStyle w:val="Compact"/>
+        <w:t xml:space="preserve">(и придётся достать отдельно):</w:t>
+      </w:r>
+    </w:p>
+    <w:p>
+      <w:pPr>
         <w:numPr>
           <w:ilvl w:val="0"/>
           <w:numId w:val="1008"/>
@@ -2640,7 +2699,7 @@
         </w:numPr>
       </w:pPr>
       <w:r>
-        <w:t xml:space="preserve">Принести с предыдущего Mac (через 1Password / iCloud Drive / scp)</w:t>
+        <w:t xml:space="preserve">Принести с предыдущего Mac через 1Password / iCloud Drive</w:t>
       </w:r>
     </w:p>
     <w:p>
@@ -2652,7 +2711,37 @@
         </w:numPr>
       </w:pPr>
       <w:r>
-        <w:t xml:space="preserve">Спросить у владельца, если ты collaborator</w:t>
+        <w:t xml:space="preserve">Достать с VPS:</w:t>
+      </w:r>
+      <w:r>
+        <w:t xml:space="preserve"> </w:t>
+      </w:r>
+      <w:r>
+        <w:rPr>
+          <w:rStyle w:val="VerbatimChar"/>
+        </w:rPr>
+        <w:t xml:space="preserve">ssh deploy@{vps-ip} "cat /home/deploy/prod/{site}/current/.env" &gt; .env.production</w:t>
+      </w:r>
+      <w:r>
+        <w:t xml:space="preserve"> </w:t>
+      </w:r>
+      <w:r>
+        <w:t xml:space="preserve">(workflow деплоя сам пишет туда</w:t>
+      </w:r>
+      <w:r>
+        <w:t xml:space="preserve"> </w:t>
+      </w:r>
+      <w:r>
+        <w:rPr>
+          <w:rStyle w:val="VerbatimChar"/>
+        </w:rPr>
+        <w:t xml:space="preserve">PROD_ENV_FILE</w:t>
+      </w:r>
+      <w:r>
+        <w:t xml:space="preserve"> </w:t>
+      </w:r>
+      <w:r>
+        <w:t xml:space="preserve">секрет на каждом push’е, так что там всегда актуальная версия)</w:t>
       </w:r>
     </w:p>
     <w:p>
@@ -2664,27 +2753,42 @@
         </w:numPr>
       </w:pPr>
       <w:r>
-        <w:t xml:space="preserve">Достать из GitHub Environment:</w:t>
-      </w:r>
-      <w:r>
-        <w:t xml:space="preserve"> </w:t>
-      </w:r>
-      <w:r>
-        <w:rPr>
-          <w:rStyle w:val="VerbatimChar"/>
-        </w:rPr>
-        <w:t xml:space="preserve">gh secret list --env production --repo &lt;owner&gt;/{site}</w:t>
-      </w:r>
-      <w:r>
-        <w:t xml:space="preserve"> </w:t>
-      </w:r>
-      <w:r>
-        <w:t xml:space="preserve">покажет имена секретов (значения GitHub не отдаёт даже владельцу — только для деплоев)</w:t>
-      </w:r>
-    </w:p>
-    <w:p>
-      <w:pPr>
-        <w:pStyle w:val="Compact"/>
+        <w:t xml:space="preserve">Узнать имена ключей:</w:t>
+      </w:r>
+      <w:r>
+        <w:t xml:space="preserve"> </w:t>
+      </w:r>
+      <w:r>
+        <w:rPr>
+          <w:rStyle w:val="VerbatimChar"/>
+        </w:rPr>
+        <w:t xml:space="preserve">gh secret list --env production --repo &lt;твой-логин&gt;/{site}</w:t>
+      </w:r>
+      <w:r>
+        <w:t xml:space="preserve"> </w:t>
+      </w:r>
+      <w:r>
+        <w:t xml:space="preserve">— но</w:t>
+      </w:r>
+      <w:r>
+        <w:t xml:space="preserve"> </w:t>
+      </w:r>
+      <w:r>
+        <w:rPr>
+          <w:b/>
+          <w:bCs/>
+        </w:rPr>
+        <w:t xml:space="preserve">значения</w:t>
+      </w:r>
+      <w:r>
+        <w:t xml:space="preserve"> </w:t>
+      </w:r>
+      <w:r>
+        <w:t xml:space="preserve">GitHub не отдаёт даже тебе как владельцу (только в момент деплоя). Список нужен только чтобы свериться «не забыл ли я какую переменную»</w:t>
+      </w:r>
+    </w:p>
+    <w:p>
+      <w:pPr>
         <w:numPr>
           <w:ilvl w:val="0"/>
           <w:numId w:val="1008"/>
@@ -2695,16 +2799,13 @@
           <w:b/>
           <w:bCs/>
         </w:rPr>
-        <w:t xml:space="preserve">SSH-ключ к VPS</w:t>
-      </w:r>
-      <w:r>
-        <w:t xml:space="preserve"> </w:t>
-      </w:r>
-      <w:r>
-        <w:t xml:space="preserve">— если ты владелец инфры, твой ключ</w:t>
-      </w:r>
-      <w:r>
-        <w:t xml:space="preserve"> </w:t>
+        <w:t xml:space="preserve">SSH-ключ к GitHub</w:t>
+      </w:r>
+      <w:r>
+        <w:t xml:space="preserve"> </w:t>
+      </w:r>
+      <w:r>
+        <w:t xml:space="preserve">(</w:t>
       </w:r>
       <w:r>
         <w:rPr>
@@ -2713,15 +2814,26 @@
         <w:t xml:space="preserve">~/.ssh/id_ed25519</w:t>
       </w:r>
       <w:r>
-        <w:t xml:space="preserve"> </w:t>
-      </w:r>
-      <w:r>
-        <w:t xml:space="preserve">уже на новом Mac (см. §0.6). Если ты collaborator — VPS-доступа у тебя нет (см. §7), это нормально.</w:t>
-      </w:r>
-    </w:p>
-    <w:p>
-      <w:pPr>
-        <w:pStyle w:val="Compact"/>
+        <w:t xml:space="preserve">) — на новом Mac ты сгенерил его в §0.6, теперь надо зарегистрировать на GitHub:</w:t>
+      </w:r>
+      <w:r>
+        <w:t xml:space="preserve"> </w:t>
+      </w:r>
+      <w:r>
+        <w:rPr>
+          <w:rStyle w:val="VerbatimChar"/>
+        </w:rPr>
+        <w:t xml:space="preserve">gh auth login</w:t>
+      </w:r>
+      <w:r>
+        <w:t xml:space="preserve"> </w:t>
+      </w:r>
+      <w:r>
+        <w:t xml:space="preserve">(он автоматически добавит публичную часть нового ключа в твой GitHub-аккаунт)</w:t>
+      </w:r>
+    </w:p>
+    <w:p>
+      <w:pPr>
         <w:numPr>
           <w:ilvl w:val="0"/>
           <w:numId w:val="1008"/>
@@ -2732,13 +2844,148 @@
           <w:b/>
           <w:bCs/>
         </w:rPr>
-        <w:t xml:space="preserve">Локальные</w:t>
-      </w:r>
-      <w:r>
-        <w:rPr>
+        <w:t xml:space="preserve">SSH-доступ к VPS</w:t>
+      </w:r>
+      <w:r>
+        <w:t xml:space="preserve"> </w:t>
+      </w:r>
+      <w:r>
+        <w:t xml:space="preserve">— публичную часть твоего нового</w:t>
+      </w:r>
+      <w:r>
+        <w:t xml:space="preserve"> </w:t>
+      </w:r>
+      <w:r>
+        <w:rPr>
+          <w:rStyle w:val="VerbatimChar"/>
+        </w:rPr>
+        <w:t xml:space="preserve">~/.ssh/id_ed25519.pub</w:t>
+      </w:r>
+      <w:r>
+        <w:t xml:space="preserve"> </w:t>
+      </w:r>
+      <w:r>
+        <w:t xml:space="preserve">надо добавить в</w:t>
+      </w:r>
+      <w:r>
+        <w:t xml:space="preserve"> </w:t>
+      </w:r>
+      <w:r>
+        <w:rPr>
+          <w:rStyle w:val="VerbatimChar"/>
+        </w:rPr>
+        <w:t xml:space="preserve">authorized_keys</w:t>
+      </w:r>
+      <w:r>
+        <w:t xml:space="preserve"> </w:t>
+      </w:r>
+      <w:r>
+        <w:t xml:space="preserve">пользователя</w:t>
+      </w:r>
+      <w:r>
+        <w:t xml:space="preserve"> </w:t>
+      </w:r>
+      <w:r>
+        <w:rPr>
+          <w:rStyle w:val="VerbatimChar"/>
+        </w:rPr>
+        <w:t xml:space="preserve">deploy</w:t>
+      </w:r>
+      <w:r>
+        <w:t xml:space="preserve"> </w:t>
+      </w:r>
+      <w:r>
+        <w:t xml:space="preserve">на VPS. Со старого Mac (где доступ есть) или через панель провайдера:</w:t>
+      </w:r>
+      <w:r>
+        <w:t xml:space="preserve"> </w:t>
+      </w:r>
+      <w:r>
+        <w:rPr>
+          <w:rStyle w:val="VerbatimChar"/>
+        </w:rPr>
+        <w:t xml:space="preserve">ssh-copy-id -i ~/.ssh/id_ed25519.pub deploy@{vps-ip}</w:t>
+      </w:r>
+      <w:r>
+        <w:t xml:space="preserve">. После — пропиши алиас в</w:t>
+      </w:r>
+      <w:r>
+        <w:t xml:space="preserve"> </w:t>
+      </w:r>
+      <w:r>
+        <w:rPr>
+          <w:rStyle w:val="VerbatimChar"/>
+        </w:rPr>
+        <w:t xml:space="preserve">~/.ssh/config</w:t>
+      </w:r>
+      <w:r>
+        <w:t xml:space="preserve">:</w:t>
+      </w:r>
+    </w:p>
+    <w:p>
+      <w:pPr>
+        <w:pStyle w:val="SourceCode"/>
+        <w:numPr>
+          <w:ilvl w:val="0"/>
+          <w:numId w:val="1000"/>
+        </w:numPr>
+      </w:pPr>
+      <w:r>
+        <w:rPr>
+          <w:rStyle w:val="VerbatimChar"/>
+        </w:rPr>
+        <w:t xml:space="preserve">Host {site}</w:t>
+      </w:r>
+      <w:r>
+        <w:br/>
+      </w:r>
+      <w:r>
+        <w:rPr>
+          <w:rStyle w:val="VerbatimChar"/>
+        </w:rPr>
+        <w:t xml:space="preserve">  HostName {vps-ip}</w:t>
+      </w:r>
+      <w:r>
+        <w:br/>
+      </w:r>
+      <w:r>
+        <w:rPr>
+          <w:rStyle w:val="VerbatimChar"/>
+        </w:rPr>
+        <w:t xml:space="preserve">  User deploy</w:t>
+      </w:r>
+      <w:r>
+        <w:br/>
+      </w:r>
+      <w:r>
+        <w:rPr>
+          <w:rStyle w:val="VerbatimChar"/>
+        </w:rPr>
+        <w:t xml:space="preserve">  IdentityFile ~/.ssh/id_ed25519</w:t>
+      </w:r>
+    </w:p>
+    <w:p>
+      <w:pPr>
+        <w:numPr>
+          <w:ilvl w:val="0"/>
+          <w:numId w:val="1008"/>
+        </w:numPr>
+      </w:pPr>
+      <w:r>
+        <w:rPr>
+          <w:rStyle w:val="VerbatimChar"/>
           <w:b/>
           <w:bCs/>
         </w:rPr>
+        <w:t xml:space="preserve">.claude/state/</w:t>
+      </w:r>
+      <w:r>
+        <w:t xml:space="preserve"> </w:t>
+      </w:r>
+      <w:r>
+        <w:t xml:space="preserve">и</w:t>
+      </w:r>
+      <w:r>
         <w:t xml:space="preserve"> </w:t>
       </w:r>
       <w:r>
@@ -2747,13 +2994,13 @@
           <w:b/>
           <w:bCs/>
         </w:rPr>
-        <w:t xml:space="preserve">.claude/state/</w:t>
-      </w:r>
-      <w:r>
-        <w:t xml:space="preserve"> </w:t>
-      </w:r>
-      <w:r>
-        <w:t xml:space="preserve">— gitignored, восстановится сам в первой сессии.</w:t>
+        <w:t xml:space="preserve">.claude/cache/</w:t>
+      </w:r>
+      <w:r>
+        <w:t xml:space="preserve"> </w:t>
+      </w:r>
+      <w:r>
+        <w:t xml:space="preserve">— gitignored, локальные кеши Claude Code, восстановятся сами в первой сессии.</w:t>
       </w:r>
     </w:p>
     <w:p>
@@ -2771,7 +3018,7 @@
         <w:t xml:space="preserve"> </w:t>
       </w:r>
       <w:r>
-        <w:t xml:space="preserve">(важно): актуальный код,</w:t>
+        <w:t xml:space="preserve">(этого достаточно для работы): актуальный код,</w:t>
       </w:r>
       <w:r>
         <w:t xml:space="preserve"> </w:t>
@@ -2810,7 +3057,79 @@
         <w:t xml:space="preserve"> </w:t>
       </w:r>
       <w:r>
-        <w:t xml:space="preserve">(project_state, decisions, lessons и т.д.), хуки, скрипты, slash-команды.</w:t>
+        <w:t xml:space="preserve">(project_state, decisions, lessons и т.д.), хуки в</w:t>
+      </w:r>
+      <w:r>
+        <w:t xml:space="preserve"> </w:t>
+      </w:r>
+      <w:r>
+        <w:rPr>
+          <w:rStyle w:val="VerbatimChar"/>
+        </w:rPr>
+        <w:t xml:space="preserve">.claude/hooks/</w:t>
+      </w:r>
+      <w:r>
+        <w:t xml:space="preserve">, slash-команды в</w:t>
+      </w:r>
+      <w:r>
+        <w:t xml:space="preserve"> </w:t>
+      </w:r>
+      <w:r>
+        <w:rPr>
+          <w:rStyle w:val="VerbatimChar"/>
+        </w:rPr>
+        <w:t xml:space="preserve">.claude/commands/</w:t>
+      </w:r>
+      <w:r>
+        <w:t xml:space="preserve">, скрипты</w:t>
+      </w:r>
+      <w:r>
+        <w:t xml:space="preserve"> </w:t>
+      </w:r>
+      <w:r>
+        <w:rPr>
+          <w:rStyle w:val="VerbatimChar"/>
+        </w:rPr>
+        <w:t xml:space="preserve">scripts/</w:t>
+      </w:r>
+      <w:r>
+        <w:t xml:space="preserve">,</w:t>
+      </w:r>
+      <w:r>
+        <w:t xml:space="preserve"> </w:t>
+      </w:r>
+      <w:r>
+        <w:rPr>
+          <w:rStyle w:val="VerbatimChar"/>
+        </w:rPr>
+        <w:t xml:space="preserve">biome.json</w:t>
+      </w:r>
+      <w:r>
+        <w:t xml:space="preserve">,</w:t>
+      </w:r>
+      <w:r>
+        <w:t xml:space="preserve"> </w:t>
+      </w:r>
+      <w:r>
+        <w:rPr>
+          <w:rStyle w:val="VerbatimChar"/>
+        </w:rPr>
+        <w:t xml:space="preserve">.tool-versions</w:t>
+      </w:r>
+      <w:r>
+        <w:t xml:space="preserve">,</w:t>
+      </w:r>
+      <w:r>
+        <w:t xml:space="preserve"> </w:t>
+      </w:r>
+      <w:r>
+        <w:rPr>
+          <w:rStyle w:val="VerbatimChar"/>
+        </w:rPr>
+        <w:t xml:space="preserve">pnpm-lock.yaml</w:t>
+      </w:r>
+      <w:r>
+        <w:t xml:space="preserve">.</w:t>
       </w:r>
     </w:p>
     <w:p>
@@ -2848,7 +3167,7 @@
         <w:t xml:space="preserve"> </w:t>
       </w:r>
       <w:r>
-        <w:t xml:space="preserve">восстановит контекст из памяти.</w:t>
+        <w:t xml:space="preserve">восстановит контекст из памяти проекта.</w:t>
       </w:r>
     </w:p>
     <w:bookmarkEnd w:id="21"/>
@@ -3780,88 +4099,190 @@
         <w:t xml:space="preserve"> </w:t>
       </w:r>
       <w:r>
-        <w:t xml:space="preserve">5. Зарегистрирует домен (см.</w:t>
-      </w:r>
-      <w:r>
-        <w:t xml:space="preserve"> </w:t>
-      </w:r>
-      <w:r>
-        <w:rPr>
-          <w:rStyle w:val="VerbatimChar"/>
-        </w:rPr>
-        <w:t xml:space="preserve">docs/domain-connect.md</w:t>
-      </w:r>
-      <w:r>
-        <w:t xml:space="preserve">) и пропишет A-запись на IP VPS</w:t>
-      </w:r>
-      <w:r>
-        <w:t xml:space="preserve"> </w:t>
-      </w:r>
-      <w:r>
-        <w:t xml:space="preserve">6. Сделает первый push в</w:t>
-      </w:r>
-      <w:r>
-        <w:t xml:space="preserve"> </w:t>
-      </w:r>
-      <w:r>
-        <w:rPr>
-          <w:rStyle w:val="VerbatimChar"/>
-        </w:rPr>
-        <w:t xml:space="preserve">main</w:t>
-      </w:r>
-      <w:r>
-        <w:t xml:space="preserve"> </w:t>
-      </w:r>
-      <w:r>
-        <w:t xml:space="preserve">→ Actions запустит первый деплой → Caddy получит сертификат при первом HTTPS-запросе</w:t>
-      </w:r>
-    </w:p>
-    <w:p>
-      <w:pPr>
-        <w:pStyle w:val="BodyText"/>
-      </w:pPr>
+        <w:t xml:space="preserve">5.</w:t>
+      </w:r>
+      <w:r>
+        <w:t xml:space="preserve"> </w:t>
+      </w:r>
       <w:r>
         <w:rPr>
           <w:b/>
           <w:bCs/>
         </w:rPr>
+        <w:t xml:space="preserve">Подскажет тебе</w:t>
+      </w:r>
+      <w:r>
+        <w:t xml:space="preserve"> </w:t>
+      </w:r>
+      <w:r>
+        <w:t xml:space="preserve">что делать с доменом (см.</w:t>
+      </w:r>
+      <w:r>
+        <w:t xml:space="preserve"> </w:t>
+      </w:r>
+      <w:r>
+        <w:rPr>
+          <w:rStyle w:val="VerbatimChar"/>
+        </w:rPr>
+        <w:t xml:space="preserve">docs/domain-connect.md</w:t>
+      </w:r>
+      <w:r>
+        <w:t xml:space="preserve">) — регистрация у регистратора и проставление A-записи на IP VPS это</w:t>
+      </w:r>
+      <w:r>
+        <w:t xml:space="preserve"> </w:t>
+      </w:r>
+      <w:r>
+        <w:rPr>
+          <w:b/>
+          <w:bCs/>
+        </w:rPr>
+        <w:t xml:space="preserve">твоя ручная работа в панели Reg.ru / GoDaddy / Cloudflare</w:t>
+      </w:r>
+      <w:r>
+        <w:t xml:space="preserve">, у Claude нет туда доступа. После того как пропишешь записи — Claude проверит через</w:t>
+      </w:r>
+      <w:r>
+        <w:t xml:space="preserve"> </w:t>
+      </w:r>
+      <w:r>
+        <w:rPr>
+          <w:rStyle w:val="VerbatimChar"/>
+        </w:rPr>
+        <w:t xml:space="preserve">dig +short {domain}</w:t>
+      </w:r>
+      <w:r>
+        <w:t xml:space="preserve">, что DNS распространился.</w:t>
+      </w:r>
+      <w:r>
+        <w:t xml:space="preserve"> </w:t>
+      </w:r>
+      <w:r>
+        <w:t xml:space="preserve">6. Сделает первый push в</w:t>
+      </w:r>
+      <w:r>
+        <w:t xml:space="preserve"> </w:t>
+      </w:r>
+      <w:r>
+        <w:rPr>
+          <w:rStyle w:val="VerbatimChar"/>
+        </w:rPr>
+        <w:t xml:space="preserve">main</w:t>
+      </w:r>
+      <w:r>
+        <w:t xml:space="preserve"> </w:t>
+      </w:r>
+      <w:r>
+        <w:t xml:space="preserve">→ Actions запустит первый деплой → Caddy получит сертификат при первом HTTPS-запросе (только когда A-запись уже работает — иначе Caddy упадёт на ACME-challenge).</w:t>
+      </w:r>
+    </w:p>
+    <w:p>
+      <w:pPr>
+        <w:pStyle w:val="BodyText"/>
+      </w:pPr>
+      <w:r>
+        <w:rPr>
+          <w:b/>
+          <w:bCs/>
+        </w:rPr>
         <w:t xml:space="preserve">Если VPS уже есть</w:t>
       </w:r>
       <w:r>
         <w:t xml:space="preserve"> </w:t>
       </w:r>
       <w:r>
-        <w:t xml:space="preserve">(на нём другие сайты) — пройди только спеку</w:t>
-      </w:r>
-      <w:r>
-        <w:t xml:space="preserve"> </w:t>
-      </w:r>
-      <w:r>
-        <w:rPr>
-          <w:rStyle w:val="VerbatimChar"/>
-        </w:rPr>
-        <w:t xml:space="preserve">docs/server-add-site.md</w:t>
-      </w:r>
-      <w:r>
-        <w:t xml:space="preserve"> </w:t>
-      </w:r>
-      <w:r>
-        <w:t xml:space="preserve">(Claude умеет): выделит порт, добавит Caddy-блок, прокинет PM2-процесс. Потом</w:t>
-      </w:r>
-      <w:r>
-        <w:t xml:space="preserve"> </w:t>
-      </w:r>
-      <w:r>
-        <w:rPr>
-          <w:rStyle w:val="VerbatimChar"/>
-        </w:rPr>
-        <w:t xml:space="preserve">01b</w:t>
-      </w:r>
-      <w:r>
-        <w:t xml:space="preserve"> </w:t>
-      </w:r>
-      <w:r>
-        <w:t xml:space="preserve">для GitHub Actions.</w:t>
+        <w:t xml:space="preserve">(на нём работают другие сайты, и ты хочешь подселить новый):</w:t>
+      </w:r>
+    </w:p>
+    <w:p>
+      <w:pPr>
+        <w:pStyle w:val="SourceCode"/>
+      </w:pPr>
+      <w:r>
+        <w:rPr>
+          <w:rStyle w:val="VerbatimChar"/>
+        </w:rPr>
+        <w:t xml:space="preserve">В Claude:</w:t>
+      </w:r>
+      <w:r>
+        <w:br/>
+      </w:r>
+      <w:r>
+        <w:rPr>
+          <w:rStyle w:val="VerbatimChar"/>
+        </w:rPr>
+        <w:t xml:space="preserve">Пройди по docs/server-add-site.md — у меня уже есть VPS, на нём работают другие сайты,</w:t>
+      </w:r>
+      <w:r>
+        <w:br/>
+      </w:r>
+      <w:r>
+        <w:rPr>
+          <w:rStyle w:val="VerbatimChar"/>
+        </w:rPr>
+        <w:t xml:space="preserve">надо подключить новый сайт {site}. Выдели свободный порт из ~/ports.md, добавь блок</w:t>
+      </w:r>
+      <w:r>
+        <w:br/>
+      </w:r>
+      <w:r>
+        <w:rPr>
+          <w:rStyle w:val="VerbatimChar"/>
+        </w:rPr>
+        <w:t xml:space="preserve">в /etc/caddy/Caddyfile.d/{site}.caddy, подними PM2-процесс {site}-prod.</w:t>
+      </w:r>
+      <w:r>
+        <w:br/>
+      </w:r>
+      <w:r>
+        <w:rPr>
+          <w:rStyle w:val="VerbatimChar"/>
+        </w:rPr>
+        <w:t xml:space="preserve">После этого пройди specs/01b-server-handoff.md для настройки GitHub Actions</w:t>
+      </w:r>
+      <w:r>
+        <w:br/>
+      </w:r>
+      <w:r>
+        <w:rPr>
+          <w:rStyle w:val="VerbatimChar"/>
+        </w:rPr>
+        <w:t xml:space="preserve">(SSH-ключ деплоя, Environment 'production' с секретами, .github/workflows/deploy-prod.yml).</w:t>
+      </w:r>
+    </w:p>
+    <w:p>
+      <w:pPr>
+        <w:pStyle w:val="FirstParagraph"/>
+      </w:pPr>
+      <w:r>
+        <w:t xml:space="preserve">Замени</w:t>
+      </w:r>
+      <w:r>
+        <w:t xml:space="preserve"> </w:t>
+      </w:r>
+      <w:r>
+        <w:rPr>
+          <w:rStyle w:val="VerbatimChar"/>
+        </w:rPr>
+        <w:t xml:space="preserve">{site}</w:t>
+      </w:r>
+      <w:r>
+        <w:t xml:space="preserve"> </w:t>
+      </w:r>
+      <w:r>
+        <w:t xml:space="preserve">на имя сайта (то же что в</w:t>
+      </w:r>
+      <w:r>
+        <w:t xml:space="preserve"> </w:t>
+      </w:r>
+      <w:r>
+        <w:rPr>
+          <w:rStyle w:val="VerbatimChar"/>
+        </w:rPr>
+        <w:t xml:space="preserve">package.json#name</w:t>
+      </w:r>
+      <w:r>
+        <w:t xml:space="preserve">).</w:t>
       </w:r>
     </w:p>
     <w:p>
@@ -3943,7 +4364,7 @@
       </w:r>
     </w:p>
     <w:bookmarkEnd w:id="25"/>
-    <w:bookmarkStart w:id="26" w:name="работа-изо-дня-в-день"/>
+    <w:bookmarkStart w:id="30" w:name="работа-изо-дня-в-день"/>
     <w:p>
       <w:pPr>
         <w:pStyle w:val="Heading2"/>
@@ -3957,146 +4378,948 @@
         <w:pStyle w:val="FirstParagraph"/>
       </w:pPr>
       <w:r>
-        <w:t xml:space="preserve">Одна спека = одна сессия чата. Цикл:</w:t>
-      </w:r>
-    </w:p>
-    <w:p>
-      <w:pPr>
-        <w:pStyle w:val="Compact"/>
+        <w:rPr>
+          <w:b/>
+          <w:bCs/>
+        </w:rPr>
+        <w:t xml:space="preserve">Главное правило:</w:t>
+      </w:r>
+      <w:r>
+        <w:t xml:space="preserve"> </w:t>
+      </w:r>
+      <w:r>
+        <w:t xml:space="preserve">одна спека = одна Claude-сессия = один чат. Между задачами</w:t>
+      </w:r>
+      <w:r>
+        <w:t xml:space="preserve"> </w:t>
+      </w:r>
+      <w:r>
+        <w:rPr>
+          <w:rStyle w:val="VerbatimChar"/>
+        </w:rPr>
+        <w:t xml:space="preserve">/clear</w:t>
+      </w:r>
+      <w:r>
+        <w:t xml:space="preserve"> </w:t>
+      </w:r>
+      <w:r>
+        <w:t xml:space="preserve">или новый чат.</w:t>
+      </w:r>
+    </w:p>
+    <w:bookmarkStart w:id="26" w:name="что-такое-slash-команды"/>
+    <w:p>
+      <w:pPr>
+        <w:pStyle w:val="Heading3"/>
+      </w:pPr>
+      <w:r>
+        <w:t xml:space="preserve">Что такое slash-команды</w:t>
+      </w:r>
+    </w:p>
+    <w:p>
+      <w:pPr>
+        <w:pStyle w:val="FirstParagraph"/>
+      </w:pPr>
+      <w:r>
+        <w:t xml:space="preserve">В чате Claude Desktop ты вводишь обычные сообщения, но есть короткие команды, которые</w:t>
+      </w:r>
+      <w:r>
+        <w:t xml:space="preserve"> </w:t>
+      </w:r>
+      <w:r>
+        <w:rPr>
+          <w:b/>
+          <w:bCs/>
+        </w:rPr>
+        <w:t xml:space="preserve">начинаются со слэша</w:t>
+      </w:r>
+      <w:r>
+        <w:t xml:space="preserve"> </w:t>
+      </w:r>
+      <w:r>
+        <w:t xml:space="preserve">(</w:t>
+      </w:r>
+      <w:r>
+        <w:rPr>
+          <w:rStyle w:val="VerbatimChar"/>
+        </w:rPr>
+        <w:t xml:space="preserve">/</w:t>
+      </w:r>
+      <w:r>
+        <w:t xml:space="preserve">) и выполняют заранее заданную инструкцию. Они лежат в папке</w:t>
+      </w:r>
+      <w:r>
+        <w:t xml:space="preserve"> </w:t>
+      </w:r>
+      <w:r>
+        <w:rPr>
+          <w:rStyle w:val="VerbatimChar"/>
+        </w:rPr>
+        <w:t xml:space="preserve">.claude/commands/</w:t>
+      </w:r>
+      <w:r>
+        <w:t xml:space="preserve"> </w:t>
+      </w:r>
+      <w:r>
+        <w:t xml:space="preserve">репо как обычные</w:t>
+      </w:r>
+      <w:r>
+        <w:t xml:space="preserve"> </w:t>
+      </w:r>
+      <w:r>
+        <w:rPr>
+          <w:rStyle w:val="VerbatimChar"/>
+        </w:rPr>
+        <w:t xml:space="preserve">.md</w:t>
+      </w:r>
+      <w:r>
+        <w:t xml:space="preserve"> </w:t>
+      </w:r>
+      <w:r>
+        <w:t xml:space="preserve">файлы — Claude Desktop сканирует папку при старте сессии и предлагает их в auto-complete (когда ты начинаешь печатать</w:t>
+      </w:r>
+      <w:r>
+        <w:t xml:space="preserve"> </w:t>
+      </w:r>
+      <w:r>
+        <w:rPr>
+          <w:rStyle w:val="VerbatimChar"/>
+        </w:rPr>
+        <w:t xml:space="preserve">/</w:t>
+      </w:r>
+      <w:r>
+        <w:t xml:space="preserve"> </w:t>
+      </w:r>
+      <w:r>
+        <w:t xml:space="preserve">в чате — выпадает список).</w:t>
+      </w:r>
+    </w:p>
+    <w:p>
+      <w:pPr>
+        <w:pStyle w:val="BodyText"/>
+      </w:pPr>
+      <w:r>
+        <w:t xml:space="preserve">В нашем bootstrap’е v3 настроены</w:t>
+      </w:r>
+      <w:r>
+        <w:t xml:space="preserve"> </w:t>
+      </w:r>
+      <w:r>
+        <w:rPr>
+          <w:b/>
+          <w:bCs/>
+        </w:rPr>
+        <w:t xml:space="preserve">три</w:t>
+      </w:r>
+      <w:r>
+        <w:t xml:space="preserve"> </w:t>
+      </w:r>
+      <w:r>
+        <w:t xml:space="preserve">slash-команды:</w:t>
+      </w:r>
+    </w:p>
+    <w:tbl>
+      <w:tblPr>
+        <w:tblStyle w:val="Table"/>
+        <w:tblW w:type="pct" w:w="5000"/>
+        <w:tblLayout w:type="fixed"/>
+        <w:tblLook w:firstRow="1" w:lastRow="0" w:firstColumn="0" w:lastColumn="0" w:noHBand="0" w:noVBand="0" w:val="0020"/>
+      </w:tblPr>
+      <w:tblGrid>
+        <w:gridCol w:w="2640"/>
+        <w:gridCol w:w="2640"/>
+        <w:gridCol w:w="2640"/>
+      </w:tblGrid>
+      <w:tr>
+        <w:trPr>
+          <w:tblHeader w:val="on"/>
+        </w:trPr>
+        <w:tc>
+          <w:tcPr/>
+          <w:p>
+            <w:pPr>
+              <w:pStyle w:val="Compact"/>
+            </w:pPr>
+            <w:r>
+              <w:t xml:space="preserve">Команда</w:t>
+            </w:r>
+          </w:p>
+        </w:tc>
+        <w:tc>
+          <w:tcPr/>
+          <w:p>
+            <w:pPr>
+              <w:pStyle w:val="Compact"/>
+            </w:pPr>
+            <w:r>
+              <w:t xml:space="preserve">Когда вызывать</w:t>
+            </w:r>
+          </w:p>
+        </w:tc>
+        <w:tc>
+          <w:tcPr/>
+          <w:p>
+            <w:pPr>
+              <w:pStyle w:val="Compact"/>
+            </w:pPr>
+            <w:r>
+              <w:t xml:space="preserve">Что делает</w:t>
+            </w:r>
+          </w:p>
+        </w:tc>
+      </w:tr>
+      <w:tr>
+        <w:tc>
+          <w:tcPr/>
+          <w:p>
+            <w:pPr>
+              <w:pStyle w:val="Compact"/>
+            </w:pPr>
+            <w:r>
+              <w:rPr>
+                <w:rStyle w:val="VerbatimChar"/>
+                <w:b/>
+                <w:bCs/>
+              </w:rPr>
+              <w:t xml:space="preserve">/resume</w:t>
+            </w:r>
+          </w:p>
+        </w:tc>
+        <w:tc>
+          <w:tcPr/>
+          <w:p>
+            <w:pPr>
+              <w:pStyle w:val="Compact"/>
+            </w:pPr>
+            <w:r>
+              <w:t xml:space="preserve">В</w:t>
+            </w:r>
+            <w:r>
+              <w:t xml:space="preserve"> </w:t>
+            </w:r>
+            <w:r>
+              <w:rPr>
+                <w:b/>
+                <w:bCs/>
+              </w:rPr>
+              <w:t xml:space="preserve">начале</w:t>
+            </w:r>
+            <w:r>
+              <w:t xml:space="preserve"> </w:t>
+            </w:r>
+            <w:r>
+              <w:t xml:space="preserve">новой сессии (после</w:t>
+            </w:r>
+            <w:r>
+              <w:t xml:space="preserve"> </w:t>
+            </w:r>
+            <w:r>
+              <w:rPr>
+                <w:rStyle w:val="VerbatimChar"/>
+              </w:rPr>
+              <w:t xml:space="preserve">/clear</w:t>
+            </w:r>
+            <w:r>
+              <w:t xml:space="preserve"> </w:t>
+            </w:r>
+            <w:r>
+              <w:t xml:space="preserve">или нового чата)</w:t>
+            </w:r>
+          </w:p>
+        </w:tc>
+        <w:tc>
+          <w:tcPr/>
+          <w:p>
+            <w:pPr>
+              <w:pStyle w:val="Compact"/>
+            </w:pPr>
+            <w:r>
+              <w:t xml:space="preserve">Прочитает</w:t>
+            </w:r>
+            <w:r>
+              <w:t xml:space="preserve"> </w:t>
+            </w:r>
+            <w:r>
+              <w:rPr>
+                <w:rStyle w:val="VerbatimChar"/>
+              </w:rPr>
+              <w:t xml:space="preserve">.claude/memory/INDEX.md</w:t>
+            </w:r>
+            <w:r>
+              <w:t xml:space="preserve"> </w:t>
+            </w:r>
+            <w:r>
+              <w:t xml:space="preserve">и</w:t>
+            </w:r>
+            <w:r>
+              <w:t xml:space="preserve"> </w:t>
+            </w:r>
+            <w:r>
+              <w:rPr>
+                <w:rStyle w:val="VerbatimChar"/>
+              </w:rPr>
+              <w:t xml:space="preserve">project_state.md</w:t>
+            </w:r>
+            <w:r>
+              <w:t xml:space="preserve">, сверится с git (uncommitted, последние коммиты), кратко резюмирует где остановились — и</w:t>
+            </w:r>
+            <w:r>
+              <w:t xml:space="preserve"> </w:t>
+            </w:r>
+            <w:r>
+              <w:rPr>
+                <w:b/>
+                <w:bCs/>
+              </w:rPr>
+              <w:t xml:space="preserve">подождёт твоего ОК</w:t>
+            </w:r>
+            <w:r>
+              <w:t xml:space="preserve"> </w:t>
+            </w:r>
+            <w:r>
+              <w:t xml:space="preserve">перед работой. Если git и память разошлись — стопнет и спросит, не действует сам.</w:t>
+            </w:r>
+          </w:p>
+        </w:tc>
+      </w:tr>
+      <w:tr>
+        <w:tc>
+          <w:tcPr/>
+          <w:p>
+            <w:pPr>
+              <w:pStyle w:val="Compact"/>
+            </w:pPr>
+            <w:r>
+              <w:rPr>
+                <w:rStyle w:val="VerbatimChar"/>
+                <w:b/>
+                <w:bCs/>
+              </w:rPr>
+              <w:t xml:space="preserve">/handoff</w:t>
+            </w:r>
+          </w:p>
+        </w:tc>
+        <w:tc>
+          <w:tcPr/>
+          <w:p>
+            <w:pPr>
+              <w:pStyle w:val="Compact"/>
+            </w:pPr>
+            <w:r>
+              <w:t xml:space="preserve">В</w:t>
+            </w:r>
+            <w:r>
+              <w:t xml:space="preserve"> </w:t>
+            </w:r>
+            <w:r>
+              <w:rPr>
+                <w:b/>
+                <w:bCs/>
+              </w:rPr>
+              <w:t xml:space="preserve">конце</w:t>
+            </w:r>
+            <w:r>
+              <w:t xml:space="preserve"> </w:t>
+            </w:r>
+            <w:r>
+              <w:t xml:space="preserve">сессии — перед</w:t>
+            </w:r>
+            <w:r>
+              <w:t xml:space="preserve"> </w:t>
+            </w:r>
+            <w:r>
+              <w:rPr>
+                <w:rStyle w:val="VerbatimChar"/>
+              </w:rPr>
+              <w:t xml:space="preserve">/clear</w:t>
+            </w:r>
+            <w:r>
+              <w:t xml:space="preserve">, перед закрытием чата, особенно если уходишь надолго</w:t>
+            </w:r>
+          </w:p>
+        </w:tc>
+        <w:tc>
+          <w:tcPr/>
+          <w:p>
+            <w:pPr>
+              <w:pStyle w:val="Compact"/>
+            </w:pPr>
+            <w:r>
+              <w:t xml:space="preserve">Обновит</w:t>
+            </w:r>
+            <w:r>
+              <w:t xml:space="preserve"> </w:t>
+            </w:r>
+            <w:r>
+              <w:rPr>
+                <w:rStyle w:val="VerbatimChar"/>
+              </w:rPr>
+              <w:t xml:space="preserve">.claude/memory/project_state.md</w:t>
+            </w:r>
+            <w:r>
+              <w:t xml:space="preserve">: добавит запись в Session log (что сделано), пересоберёт Active phase и Next steps, спросит про uncommitted-изменения (коммитить или сохранить как stash). Без</w:t>
+            </w:r>
+            <w:r>
+              <w:t xml:space="preserve"> </w:t>
+            </w:r>
+            <w:r>
+              <w:rPr>
+                <w:rStyle w:val="VerbatimChar"/>
+              </w:rPr>
+              <w:t xml:space="preserve">/handoff</w:t>
+            </w:r>
+            <w:r>
+              <w:t xml:space="preserve"> </w:t>
+            </w:r>
+            <w:r>
+              <w:t xml:space="preserve">следующая сессия</w:t>
+            </w:r>
+            <w:r>
+              <w:t xml:space="preserve"> </w:t>
+            </w:r>
+            <w:r>
+              <w:rPr>
+                <w:b/>
+                <w:bCs/>
+              </w:rPr>
+              <w:t xml:space="preserve">не будет знать контекст</w:t>
+            </w:r>
+            <w:r>
+              <w:t xml:space="preserve"> </w:t>
+            </w:r>
+            <w:r>
+              <w:t xml:space="preserve">— придётся разбираться с нуля.</w:t>
+            </w:r>
+          </w:p>
+        </w:tc>
+      </w:tr>
+      <w:tr>
+        <w:tc>
+          <w:tcPr/>
+          <w:p>
+            <w:pPr>
+              <w:pStyle w:val="Compact"/>
+            </w:pPr>
+            <w:r>
+              <w:rPr>
+                <w:rStyle w:val="VerbatimChar"/>
+                <w:b/>
+                <w:bCs/>
+              </w:rPr>
+              <w:t xml:space="preserve">/catchup</w:t>
+            </w:r>
+          </w:p>
+        </w:tc>
+        <w:tc>
+          <w:tcPr/>
+          <w:p>
+            <w:pPr>
+              <w:pStyle w:val="Compact"/>
+            </w:pPr>
+            <w:r>
+              <w:t xml:space="preserve">После</w:t>
+            </w:r>
+            <w:r>
+              <w:t xml:space="preserve"> </w:t>
+            </w:r>
+            <w:r>
+              <w:rPr>
+                <w:b/>
+                <w:bCs/>
+              </w:rPr>
+              <w:t xml:space="preserve">долгого перерыва</w:t>
+            </w:r>
+            <w:r>
+              <w:t xml:space="preserve"> </w:t>
+            </w:r>
+            <w:r>
+              <w:t xml:space="preserve">(несколько дней/недель), когда</w:t>
+            </w:r>
+            <w:r>
+              <w:t xml:space="preserve"> </w:t>
+            </w:r>
+            <w:r>
+              <w:rPr>
+                <w:rStyle w:val="VerbatimChar"/>
+              </w:rPr>
+              <w:t xml:space="preserve">/resume</w:t>
+            </w:r>
+            <w:r>
+              <w:t xml:space="preserve"> </w:t>
+            </w:r>
+            <w:r>
+              <w:t xml:space="preserve">дал короткое резюме, но хочется глубже понять что произошло</w:t>
+            </w:r>
+          </w:p>
+        </w:tc>
+        <w:tc>
+          <w:tcPr/>
+          <w:p>
+            <w:pPr>
+              <w:pStyle w:val="Compact"/>
+            </w:pPr>
+            <w:r>
+              <w:t xml:space="preserve">Глубже копнёт</w:t>
+            </w:r>
+            <w:r>
+              <w:t xml:space="preserve"> </w:t>
+            </w:r>
+            <w:r>
+              <w:rPr>
+                <w:rStyle w:val="VerbatimChar"/>
+              </w:rPr>
+              <w:t xml:space="preserve">git log</w:t>
+            </w:r>
+            <w:r>
+              <w:t xml:space="preserve">, последние PR, сравнит с памятью. Полезно когда в проекте параллельно работали другие разработчики и ты хочешь увидеть «что нового».</w:t>
+            </w:r>
+          </w:p>
+        </w:tc>
+      </w:tr>
+    </w:tbl>
+    <w:p>
+      <w:pPr>
+        <w:pStyle w:val="BodyText"/>
+      </w:pPr>
+      <w:r>
+        <w:t xml:space="preserve">Подробное содержимое команд — в</w:t>
+      </w:r>
+      <w:r>
+        <w:t xml:space="preserve"> </w:t>
+      </w:r>
+      <w:r>
+        <w:rPr>
+          <w:rStyle w:val="VerbatimChar"/>
+        </w:rPr>
+        <w:t xml:space="preserve">.claude/commands/{handoff,resume,catchup}.md</w:t>
+      </w:r>
+      <w:r>
+        <w:t xml:space="preserve">. Их можно править под себя (например, добавить в</w:t>
+      </w:r>
+      <w:r>
+        <w:t xml:space="preserve"> </w:t>
+      </w:r>
+      <w:r>
+        <w:rPr>
+          <w:rStyle w:val="VerbatimChar"/>
+        </w:rPr>
+        <w:t xml:space="preserve">/handoff</w:t>
+      </w:r>
+      <w:r>
+        <w:t xml:space="preserve"> </w:t>
+      </w:r>
+      <w:r>
+        <w:t xml:space="preserve">свою привычку коммитить только после ревью).</w:t>
+      </w:r>
+    </w:p>
+    <w:bookmarkEnd w:id="26"/>
+    <w:bookmarkStart w:id="27" w:name="цикл-одной-задачи"/>
+    <w:p>
+      <w:pPr>
+        <w:pStyle w:val="Heading3"/>
+      </w:pPr>
+      <w:r>
+        <w:t xml:space="preserve">Цикл одной задачи</w:t>
+      </w:r>
+    </w:p>
+    <w:p>
+      <w:pPr>
+        <w:pStyle w:val="SourceCode"/>
+      </w:pPr>
+      <w:r>
+        <w:rPr>
+          <w:rStyle w:val="VerbatimChar"/>
+        </w:rPr>
+        <w:t xml:space="preserve">[стартуешь чат, открываешь папку]</w:t>
+      </w:r>
+      <w:r>
+        <w:br/>
+      </w:r>
+      <w:r>
+        <w:rPr>
+          <w:rStyle w:val="VerbatimChar"/>
+        </w:rPr>
+        <w:t xml:space="preserve">       ↓</w:t>
+      </w:r>
+      <w:r>
+        <w:br/>
+      </w:r>
+      <w:r>
+        <w:rPr>
+          <w:rStyle w:val="VerbatimChar"/>
+        </w:rPr>
+        <w:t xml:space="preserve">[session-start хук: git fetch + проверка отставания ветки]</w:t>
+      </w:r>
+      <w:r>
+        <w:br/>
+      </w:r>
+      <w:r>
+        <w:rPr>
+          <w:rStyle w:val="VerbatimChar"/>
+        </w:rPr>
+        <w:t xml:space="preserve">       ↓</w:t>
+      </w:r>
+      <w:r>
+        <w:br/>
+      </w:r>
+      <w:r>
+        <w:rPr>
+          <w:rStyle w:val="VerbatimChar"/>
+        </w:rPr>
+        <w:t xml:space="preserve">   /resume                ← Claude резюмирует где остановились</w:t>
+      </w:r>
+      <w:r>
+        <w:br/>
+      </w:r>
+      <w:r>
+        <w:rPr>
+          <w:rStyle w:val="VerbatimChar"/>
+        </w:rPr>
+        <w:t xml:space="preserve">       ↓</w:t>
+      </w:r>
+      <w:r>
+        <w:br/>
+      </w:r>
+      <w:r>
+        <w:rPr>
+          <w:rStyle w:val="VerbatimChar"/>
+        </w:rPr>
+        <w:t xml:space="preserve">[обсуждаешь / планируешь / ждёшь plan mode]</w:t>
+      </w:r>
+      <w:r>
+        <w:br/>
+      </w:r>
+      <w:r>
+        <w:rPr>
+          <w:rStyle w:val="VerbatimChar"/>
+        </w:rPr>
+        <w:t xml:space="preserve">       ↓</w:t>
+      </w:r>
+      <w:r>
+        <w:br/>
+      </w:r>
+      <w:r>
+        <w:rPr>
+          <w:rStyle w:val="VerbatimChar"/>
+        </w:rPr>
+        <w:t xml:space="preserve">[Claude работает по спеке: коммитит после каждой подзадачи]</w:t>
+      </w:r>
+      <w:r>
+        <w:br/>
+      </w:r>
+      <w:r>
+        <w:rPr>
+          <w:rStyle w:val="VerbatimChar"/>
+        </w:rPr>
+        <w:t xml:space="preserve">       ↓</w:t>
+      </w:r>
+      <w:r>
+        <w:br/>
+      </w:r>
+      <w:r>
+        <w:rPr>
+          <w:rStyle w:val="VerbatimChar"/>
+        </w:rPr>
+        <w:t xml:space="preserve">   /handoff               ← Claude обновляет project_state.md</w:t>
+      </w:r>
+      <w:r>
+        <w:br/>
+      </w:r>
+      <w:r>
+        <w:rPr>
+          <w:rStyle w:val="VerbatimChar"/>
+        </w:rPr>
+        <w:t xml:space="preserve">       ↓</w:t>
+      </w:r>
+      <w:r>
+        <w:br/>
+      </w:r>
+      <w:r>
+        <w:rPr>
+          <w:rStyle w:val="VerbatimChar"/>
+        </w:rPr>
+        <w:t xml:space="preserve">[stop-хук напомнит про /handoff если забыл и были коммиты]</w:t>
+      </w:r>
+      <w:r>
+        <w:br/>
+      </w:r>
+      <w:r>
+        <w:rPr>
+          <w:rStyle w:val="VerbatimChar"/>
+        </w:rPr>
+        <w:t xml:space="preserve">       ↓</w:t>
+      </w:r>
+      <w:r>
+        <w:br/>
+      </w:r>
+      <w:r>
+        <w:rPr>
+          <w:rStyle w:val="VerbatimChar"/>
+        </w:rPr>
+        <w:t xml:space="preserve">   /clear                 ← очистка контекста перед новой задачей</w:t>
+      </w:r>
+      <w:r>
+        <w:br/>
+      </w:r>
+      <w:r>
+        <w:rPr>
+          <w:rStyle w:val="VerbatimChar"/>
+        </w:rPr>
+        <w:t xml:space="preserve">       ↓</w:t>
+      </w:r>
+      <w:r>
+        <w:br/>
+      </w:r>
+      <w:r>
+        <w:rPr>
+          <w:rStyle w:val="VerbatimChar"/>
+        </w:rPr>
+        <w:t xml:space="preserve">[новая задача → новый /resume или новый чат]</w:t>
+      </w:r>
+    </w:p>
+    <w:bookmarkEnd w:id="27"/>
+    <w:bookmarkStart w:id="28" w:name="если-первая-сессия-в-новом-проекте"/>
+    <w:p>
+      <w:pPr>
+        <w:pStyle w:val="Heading3"/>
+      </w:pPr>
+      <w:r>
+        <w:t xml:space="preserve">Если первая сессия в новом проекте</w:t>
+      </w:r>
+    </w:p>
+    <w:p>
+      <w:pPr>
+        <w:pStyle w:val="FirstParagraph"/>
+      </w:pPr>
+      <w:r>
+        <w:t xml:space="preserve">В новом проекте</w:t>
+      </w:r>
+      <w:r>
+        <w:t xml:space="preserve"> </w:t>
+      </w:r>
+      <w:r>
+        <w:rPr>
+          <w:rStyle w:val="VerbatimChar"/>
+        </w:rPr>
+        <w:t xml:space="preserve">.claude/memory/project_state.md</w:t>
+      </w:r>
+      <w:r>
+        <w:t xml:space="preserve"> </w:t>
+      </w:r>
+      <w:r>
+        <w:t xml:space="preserve">ещё пустой шаблон,</w:t>
+      </w:r>
+      <w:r>
+        <w:t xml:space="preserve"> </w:t>
+      </w:r>
+      <w:r>
+        <w:rPr>
+          <w:rStyle w:val="VerbatimChar"/>
+        </w:rPr>
+        <w:t xml:space="preserve">/resume</w:t>
+      </w:r>
+      <w:r>
+        <w:t xml:space="preserve"> </w:t>
+      </w:r>
+      <w:r>
+        <w:t xml:space="preserve">ничего полезного не покажет. Используй промпт из §3 (</w:t>
+      </w:r>
+      <w:r>
+        <w:rPr>
+          <w:rStyle w:val="VerbatimChar"/>
+        </w:rPr>
+        <w:t xml:space="preserve">Прочитай CLAUDE.md и specs/INDEX.md...</w:t>
+      </w:r>
+      <w:r>
+        <w:t xml:space="preserve">). С следующей сессии — уже</w:t>
+      </w:r>
+      <w:r>
+        <w:t xml:space="preserve"> </w:t>
+      </w:r>
+      <w:r>
+        <w:rPr>
+          <w:rStyle w:val="VerbatimChar"/>
+        </w:rPr>
+        <w:t xml:space="preserve">/resume</w:t>
+      </w:r>
+      <w:r>
+        <w:t xml:space="preserve">.</w:t>
+      </w:r>
+    </w:p>
+    <w:bookmarkEnd w:id="28"/>
+    <w:bookmarkStart w:id="29" w:name="если-resume-или-handoff-не-работают"/>
+    <w:p>
+      <w:pPr>
+        <w:pStyle w:val="Heading3"/>
+      </w:pPr>
+      <w:r>
+        <w:t xml:space="preserve">Если</w:t>
+      </w:r>
+      <w:r>
+        <w:t xml:space="preserve"> </w:t>
+      </w:r>
+      <w:r>
+        <w:rPr>
+          <w:rStyle w:val="VerbatimChar"/>
+        </w:rPr>
+        <w:t xml:space="preserve">/resume</w:t>
+      </w:r>
+      <w:r>
+        <w:t xml:space="preserve"> </w:t>
+      </w:r>
+      <w:r>
+        <w:t xml:space="preserve">или</w:t>
+      </w:r>
+      <w:r>
+        <w:t xml:space="preserve"> </w:t>
+      </w:r>
+      <w:r>
+        <w:rPr>
+          <w:rStyle w:val="VerbatimChar"/>
+        </w:rPr>
+        <w:t xml:space="preserve">/handoff</w:t>
+      </w:r>
+      <w:r>
+        <w:t xml:space="preserve"> </w:t>
+      </w:r>
+      <w:r>
+        <w:t xml:space="preserve">не работают</w:t>
+      </w:r>
+    </w:p>
+    <w:p>
+      <w:pPr>
+        <w:pStyle w:val="FirstParagraph"/>
+      </w:pPr>
+      <w:r>
+        <w:t xml:space="preserve">Старые версии Claude Desktop могут не сканировать</w:t>
+      </w:r>
+      <w:r>
+        <w:t xml:space="preserve"> </w:t>
+      </w:r>
+      <w:r>
+        <w:rPr>
+          <w:rStyle w:val="VerbatimChar"/>
+        </w:rPr>
+        <w:t xml:space="preserve">.claude/commands/</w:t>
+      </w:r>
+      <w:r>
+        <w:t xml:space="preserve">. Тогда вручную (длинные эквиваленты):</w:t>
+      </w:r>
+    </w:p>
+    <w:p>
+      <w:pPr>
         <w:numPr>
           <w:ilvl w:val="0"/>
           <w:numId w:val="1012"/>
         </w:numPr>
       </w:pPr>
       <w:r>
-        <w:t xml:space="preserve">Стартуешь сессию — Claude по</w:t>
-      </w:r>
-      <w:r>
-        <w:t xml:space="preserve"> </w:t>
-      </w:r>
-      <w:r>
-        <w:rPr>
-          <w:rStyle w:val="VerbatimChar"/>
-        </w:rPr>
-        <w:t xml:space="preserve">session-start</w:t>
-      </w:r>
-      <w:r>
-        <w:t xml:space="preserve"> </w:t>
-      </w:r>
-      <w:r>
-        <w:t xml:space="preserve">хуку фетчит origin и подсказывает если ветка отстала.</w:t>
-      </w:r>
-    </w:p>
-    <w:p>
-      <w:pPr>
-        <w:pStyle w:val="Compact"/>
+        <w:t xml:space="preserve">Вместо</w:t>
+      </w:r>
+      <w:r>
+        <w:t xml:space="preserve"> </w:t>
+      </w:r>
+      <w:r>
+        <w:rPr>
+          <w:rStyle w:val="VerbatimChar"/>
+        </w:rPr>
+        <w:t xml:space="preserve">/resume</w:t>
+      </w:r>
+      <w:r>
+        <w:t xml:space="preserve">:</w:t>
+      </w:r>
+    </w:p>
+    <w:p>
+      <w:pPr>
+        <w:pStyle w:val="SourceCode"/>
+        <w:numPr>
+          <w:ilvl w:val="0"/>
+          <w:numId w:val="1000"/>
+        </w:numPr>
+      </w:pPr>
+      <w:r>
+        <w:rPr>
+          <w:rStyle w:val="VerbatimChar"/>
+        </w:rPr>
+        <w:t xml:space="preserve">Прочитай .claude/memory/INDEX.md, .claude/memory/project_state.md.</w:t>
+      </w:r>
+      <w:r>
+        <w:br/>
+      </w:r>
+      <w:r>
+        <w:rPr>
+          <w:rStyle w:val="VerbatimChar"/>
+        </w:rPr>
+        <w:t xml:space="preserve">Сверь с git status и последними коммитами. Кратко резюмируй где остановились.</w:t>
+      </w:r>
+      <w:r>
+        <w:br/>
+      </w:r>
+      <w:r>
+        <w:rPr>
+          <w:rStyle w:val="VerbatimChar"/>
+        </w:rPr>
+        <w:t xml:space="preserve">Жди ОК перед работой.</w:t>
+      </w:r>
+    </w:p>
+    <w:p>
+      <w:pPr>
         <w:numPr>
           <w:ilvl w:val="0"/>
           <w:numId w:val="1012"/>
         </w:numPr>
       </w:pPr>
       <w:r>
-        <w:t xml:space="preserve">Работаешь по спеке.</w:t>
-      </w:r>
-    </w:p>
-    <w:p>
-      <w:pPr>
-        <w:pStyle w:val="Compact"/>
+        <w:t xml:space="preserve">Вместо</w:t>
+      </w:r>
+      <w:r>
+        <w:t xml:space="preserve"> </w:t>
+      </w:r>
+      <w:r>
+        <w:rPr>
+          <w:rStyle w:val="VerbatimChar"/>
+        </w:rPr>
+        <w:t xml:space="preserve">/handoff</w:t>
+      </w:r>
+      <w:r>
+        <w:t xml:space="preserve">:</w:t>
+      </w:r>
+    </w:p>
+    <w:p>
+      <w:pPr>
+        <w:pStyle w:val="SourceCode"/>
         <w:numPr>
           <w:ilvl w:val="0"/>
-          <w:numId w:val="1012"/>
+          <w:numId w:val="1000"/>
         </w:numPr>
       </w:pPr>
       <w:r>
         <w:rPr>
-          <w:b/>
-          <w:bCs/>
-        </w:rPr>
-        <w:t xml:space="preserve">Закончил (или уходишь надолго):</w:t>
-      </w:r>
-      <w:r>
-        <w:t xml:space="preserve"> </w:t>
-      </w:r>
-      <w:r>
-        <w:t xml:space="preserve">промпт</w:t>
-      </w:r>
-      <w:r>
-        <w:t xml:space="preserve"> </w:t>
-      </w:r>
-      <w:r>
-        <w:rPr>
-          <w:rStyle w:val="VerbatimChar"/>
-        </w:rPr>
-        <w:t xml:space="preserve">/handoff</w:t>
-      </w:r>
-      <w:r>
-        <w:t xml:space="preserve"> </w:t>
-      </w:r>
-      <w:r>
-        <w:t xml:space="preserve">— Claude обновит</w:t>
-      </w:r>
-      <w:r>
-        <w:t xml:space="preserve"> </w:t>
-      </w:r>
-      <w:r>
-        <w:rPr>
-          <w:rStyle w:val="VerbatimChar"/>
-        </w:rPr>
-        <w:t xml:space="preserve">.claude/memory/project_state.md</w:t>
-      </w:r>
-      <w:r>
-        <w:t xml:space="preserve"> </w:t>
-      </w:r>
-      <w:r>
-        <w:t xml:space="preserve">(запись в Session log, Active phase, Next steps), спросит про uncommitted-изменения.</w:t>
-      </w:r>
-    </w:p>
-    <w:p>
-      <w:pPr>
-        <w:pStyle w:val="Compact"/>
-        <w:numPr>
-          <w:ilvl w:val="0"/>
-          <w:numId w:val="1012"/>
-        </w:numPr>
-      </w:pPr>
-      <w:r>
-        <w:rPr>
-          <w:rStyle w:val="VerbatimChar"/>
-        </w:rPr>
-        <w:t xml:space="preserve">/clear</w:t>
-      </w:r>
-      <w:r>
-        <w:t xml:space="preserve"> </w:t>
-      </w:r>
-      <w:r>
-        <w:t xml:space="preserve">или новый чат.</w:t>
-      </w:r>
-    </w:p>
-    <w:p>
-      <w:pPr>
-        <w:pStyle w:val="FirstParagraph"/>
-      </w:pPr>
-      <w:r>
-        <w:t xml:space="preserve">Stop-хук подскажет про</w:t>
-      </w:r>
-      <w:r>
-        <w:t xml:space="preserve"> </w:t>
-      </w:r>
-      <w:r>
-        <w:rPr>
-          <w:rStyle w:val="VerbatimChar"/>
-        </w:rPr>
-        <w:t xml:space="preserve">/handoff</w:t>
-      </w:r>
-      <w:r>
-        <w:t xml:space="preserve"> </w:t>
-      </w:r>
-      <w:r>
-        <w:t xml:space="preserve">если в сессии были коммиты — он не блокирует, просто напоминает.</w:t>
-      </w:r>
-    </w:p>
-    <w:bookmarkEnd w:id="26"/>
-    <w:bookmarkStart w:id="27" w:name="вернуться-к-уже-начатому-сайту"/>
+          <w:rStyle w:val="VerbatimChar"/>
+        </w:rPr>
+        <w:t xml:space="preserve">Обнови .claude/memory/project_state.md: добавь запись в Session log про эту сессию</w:t>
+      </w:r>
+      <w:r>
+        <w:br/>
+      </w:r>
+      <w:r>
+        <w:rPr>
+          <w:rStyle w:val="VerbatimChar"/>
+        </w:rPr>
+        <w:t xml:space="preserve">(что сделано, какие файлы тронуты), обнови Active phase и Next steps.</w:t>
+      </w:r>
+      <w:r>
+        <w:br/>
+      </w:r>
+      <w:r>
+        <w:rPr>
+          <w:rStyle w:val="VerbatimChar"/>
+        </w:rPr>
+        <w:t xml:space="preserve">Спроси меня про uncommitted-изменения если есть.</w:t>
+      </w:r>
+    </w:p>
+    <w:bookmarkEnd w:id="29"/>
+    <w:bookmarkEnd w:id="30"/>
+    <w:bookmarkStart w:id="31" w:name="вернуться-к-уже-начатому-сайту"/>
     <w:p>
       <w:pPr>
         <w:pStyle w:val="Heading2"/>
@@ -4223,8 +5446,8 @@
         <w:t xml:space="preserve">Прочитай .claude/memory/INDEX.md, .claude/memory/project_state.md и кратко резюмируй где мы остановились. Жди ОК.</w:t>
       </w:r>
     </w:p>
-    <w:bookmarkEnd w:id="27"/>
-    <w:bookmarkStart w:id="28" w:name="несколько-сайтов-одновременно"/>
+    <w:bookmarkEnd w:id="31"/>
+    <w:bookmarkStart w:id="32" w:name="несколько-сайтов-одновременно"/>
     <w:p>
       <w:pPr>
         <w:pStyle w:val="Heading2"/>
@@ -4286,8 +5509,8 @@
         </w:pict>
       </w:r>
     </w:p>
-    <w:bookmarkEnd w:id="28"/>
-    <w:bookmarkStart w:id="34" w:name="подключить-второго-разработчика"/>
+    <w:bookmarkEnd w:id="32"/>
+    <w:bookmarkStart w:id="38" w:name="подключить-второго-разработчика"/>
     <w:p>
       <w:pPr>
         <w:pStyle w:val="Heading2"/>
@@ -4296,7 +5519,7 @@
         <w:t xml:space="preserve">7. Подключить второго разработчика</w:t>
       </w:r>
     </w:p>
-    <w:bookmarkStart w:id="29" w:name="подготовка-репо-один-раз"/>
+    <w:bookmarkStart w:id="33" w:name="подготовка-репо-один-раз"/>
     <w:p>
       <w:pPr>
         <w:pStyle w:val="Heading3"/>
@@ -4657,8 +5880,8 @@
         <w:t xml:space="preserve">"Skipping protection (private repo on free plan)"</w:t>
       </w:r>
     </w:p>
-    <w:bookmarkEnd w:id="29"/>
-    <w:bookmarkStart w:id="30" w:name="пригласить-коллегу"/>
+    <w:bookmarkEnd w:id="33"/>
+    <w:bookmarkStart w:id="34" w:name="пригласить-коллегу"/>
     <w:p>
       <w:pPr>
         <w:pStyle w:val="Heading3"/>
@@ -4745,8 +5968,8 @@
         <w:t xml:space="preserve">в репо.</w:t>
       </w:r>
     </w:p>
-    <w:bookmarkEnd w:id="30"/>
-    <w:bookmarkStart w:id="31" w:name="граница-доступа"/>
+    <w:bookmarkEnd w:id="34"/>
+    <w:bookmarkStart w:id="35" w:name="граница-доступа"/>
     <w:p>
       <w:pPr>
         <w:pStyle w:val="Heading3"/>
@@ -4896,8 +6119,8 @@
         <w:t xml:space="preserve">— нет, gitignored</w:t>
       </w:r>
     </w:p>
-    <w:bookmarkEnd w:id="31"/>
-    <w:bookmarkStart w:id="32" w:name="multi-claude-protocol-для-коллабораторов"/>
+    <w:bookmarkEnd w:id="35"/>
+    <w:bookmarkStart w:id="36" w:name="multi-claude-protocol-для-коллабораторов"/>
     <w:p>
       <w:pPr>
         <w:pStyle w:val="Heading3"/>
@@ -5061,8 +6284,8 @@
         <w:t xml:space="preserve">(alice работает над сайтом A, я над сайтом B) — никаких ограничений, параллелим свободно.</w:t>
       </w:r>
     </w:p>
-    <w:bookmarkEnd w:id="32"/>
-    <w:bookmarkStart w:id="33" w:name="memory-файлы-и-git-merge"/>
+    <w:bookmarkEnd w:id="36"/>
+    <w:bookmarkStart w:id="37" w:name="memory-файлы-и-git-merge"/>
     <w:p>
       <w:pPr>
         <w:pStyle w:val="Heading3"/>
@@ -5352,9 +6575,9 @@
         <w:t xml:space="preserve">через GitHub UI (UI часто умеет merge простых конфликтов сам)</w:t>
       </w:r>
     </w:p>
-    <w:bookmarkEnd w:id="33"/>
-    <w:bookmarkEnd w:id="34"/>
-    <w:bookmarkStart w:id="35" w:name="секреты-на-vps"/>
+    <w:bookmarkEnd w:id="37"/>
+    <w:bookmarkEnd w:id="38"/>
+    <w:bookmarkStart w:id="39" w:name="секреты-на-vps"/>
     <w:p>
       <w:pPr>
         <w:pStyle w:val="Heading2"/>
@@ -5838,8 +7061,8 @@
         <w:t xml:space="preserve">всё равно нужен, чтобы изменение пережило деплой.</w:t>
       </w:r>
     </w:p>
-    <w:bookmarkEnd w:id="35"/>
-    <w:bookmarkStart w:id="36" w:name="сломал-прод"/>
+    <w:bookmarkEnd w:id="39"/>
+    <w:bookmarkStart w:id="40" w:name="сломал-прод"/>
     <w:p>
       <w:pPr>
         <w:pStyle w:val="Heading2"/>
@@ -6014,8 +7237,8 @@
         <w:t xml:space="preserve">git упадёт «commit has more than one parent»).</w:t>
       </w:r>
     </w:p>
-    <w:bookmarkEnd w:id="36"/>
-    <w:bookmarkStart w:id="37" w:name="мигрировать-старый-сайт-v2.x-на-v3"/>
+    <w:bookmarkEnd w:id="40"/>
+    <w:bookmarkStart w:id="45" w:name="мигрировать-старый-сайт-v2.x-на-v3"/>
     <w:p>
       <w:pPr>
         <w:pStyle w:val="Heading2"/>
@@ -6032,11 +7255,137 @@
         <w:t xml:space="preserve">Если у тебя есть сайт, поднятый из bootstrap’а старой версии (v2.0–v2.4) и хочется переехать на v3.0 — это отдельная задача, не обязательная.</w:t>
       </w:r>
     </w:p>
+    <w:bookmarkStart w:id="41" w:name="X22f4231ab7ed870b802bcff46003ea59a0c5bed"/>
+    <w:p>
+      <w:pPr>
+        <w:pStyle w:val="Heading3"/>
+      </w:pPr>
+      <w:r>
+        <w:t xml:space="preserve">Как это работает (без локальной копии bootstrap’а)</w:t>
+      </w:r>
+    </w:p>
+    <w:p>
+      <w:pPr>
+        <w:pStyle w:val="FirstParagraph"/>
+      </w:pPr>
+      <w:r>
+        <w:t xml:space="preserve">Bootstrap-репо (</w:t>
+      </w:r>
+      <w:r>
+        <w:rPr>
+          <w:rStyle w:val="VerbatimChar"/>
+        </w:rPr>
+        <w:t xml:space="preserve">tem11134v2-cmd/web-dev-bootstrap</w:t>
+      </w:r>
+      <w:r>
+        <w:t xml:space="preserve">)</w:t>
+      </w:r>
+      <w:r>
+        <w:t xml:space="preserve"> </w:t>
+      </w:r>
+      <w:r>
+        <w:rPr>
+          <w:b/>
+          <w:bCs/>
+        </w:rPr>
+        <w:t xml:space="preserve">публичный</w:t>
+      </w:r>
+      <w:r>
+        <w:t xml:space="preserve"> </w:t>
+      </w:r>
+      <w:r>
+        <w:t xml:space="preserve">— все его файлы можно читать с любого Mac через GitHub raw URL без аутентификации и без локального клона. То есть</w:t>
+      </w:r>
+      <w:r>
+        <w:t xml:space="preserve"> </w:t>
+      </w:r>
+      <w:r>
+        <w:rPr>
+          <w:b/>
+          <w:bCs/>
+        </w:rPr>
+        <w:t xml:space="preserve">миграция работает с любой машины</w:t>
+      </w:r>
+      <w:r>
+        <w:t xml:space="preserve">: твой основной Mac, новый ноут, ноут друга — везде одинаково.</w:t>
+      </w:r>
+    </w:p>
     <w:p>
       <w:pPr>
         <w:pStyle w:val="BodyText"/>
       </w:pPr>
       <w:r>
+        <w:t xml:space="preserve">ТЗ-2 (</w:t>
+      </w:r>
+      <w:r>
+        <w:rPr>
+          <w:rStyle w:val="VerbatimChar"/>
+        </w:rPr>
+        <w:t xml:space="preserve">_BUILD/v3/02-migrate-existing-project.md</w:t>
+      </w:r>
+      <w:r>
+        <w:t xml:space="preserve">) внутри использует helper-функцию, которая автоматически определяет:</w:t>
+      </w:r>
+      <w:r>
+        <w:t xml:space="preserve"> </w:t>
+      </w:r>
+      <w:r>
+        <w:t xml:space="preserve">- Есть ли локально</w:t>
+      </w:r>
+      <w:r>
+        <w:t xml:space="preserve"> </w:t>
+      </w:r>
+      <w:r>
+        <w:rPr>
+          <w:rStyle w:val="VerbatimChar"/>
+        </w:rPr>
+        <w:t xml:space="preserve">~/ClaudeCode/web-dev-bootstrap/</w:t>
+      </w:r>
+      <w:r>
+        <w:t xml:space="preserve"> </w:t>
+      </w:r>
+      <w:r>
+        <w:t xml:space="preserve">→ берёт файлы оттуда (быстрее, offline)</w:t>
+      </w:r>
+      <w:r>
+        <w:t xml:space="preserve"> </w:t>
+      </w:r>
+      <w:r>
+        <w:t xml:space="preserve">- Нет → скачивает через</w:t>
+      </w:r>
+      <w:r>
+        <w:t xml:space="preserve"> </w:t>
+      </w:r>
+      <w:r>
+        <w:rPr>
+          <w:rStyle w:val="VerbatimChar"/>
+        </w:rPr>
+        <w:t xml:space="preserve">curl https://raw.githubusercontent.com/tem11134v2-cmd/web-dev-bootstrap/v3.0/...</w:t>
+      </w:r>
+    </w:p>
+    <w:p>
+      <w:pPr>
+        <w:pStyle w:val="BodyText"/>
+      </w:pPr>
+      <w:r>
+        <w:t xml:space="preserve">Тебе ничего настраивать не надо — Claude сам разберётся.</w:t>
+      </w:r>
+    </w:p>
+    <w:bookmarkEnd w:id="41"/>
+    <w:bookmarkStart w:id="42" w:name="запуск"/>
+    <w:p>
+      <w:pPr>
+        <w:pStyle w:val="Heading3"/>
+      </w:pPr>
+      <w:r>
+        <w:t xml:space="preserve">Запуск</w:t>
+      </w:r>
+    </w:p>
+    <w:p>
+      <w:pPr>
+        <w:pStyle w:val="FirstParagraph"/>
+      </w:pPr>
+      <w:r>
         <w:t xml:space="preserve">В папке старого сайта — новый Claude-чат. Стартовый промпт:</w:t>
       </w:r>
     </w:p>
@@ -6048,7 +7397,7 @@
         <w:rPr>
           <w:rStyle w:val="VerbatimChar"/>
         </w:rPr>
-        <w:t xml:space="preserve">Прочитай файл ~/ClaudeCode/web-dev-bootstrap/_BUILD/v3/02-migrate-existing-project.md</w:t>
+        <w:t xml:space="preserve">Прочитай файл ТЗ миграции по URL:</w:t>
       </w:r>
       <w:r>
         <w:br/>
@@ -6057,7 +7406,28 @@
         <w:rPr>
           <w:rStyle w:val="VerbatimChar"/>
         </w:rPr>
-        <w:t xml:space="preserve">и выполни его на этом проекте. Сначала покажи план миграции, жди подтверждения.</w:t>
+        <w:t xml:space="preserve">https://raw.githubusercontent.com/tem11134v2-cmd/web-dev-bootstrap/v3.0/_BUILD/v3/02-migrate-existing-project.md</w:t>
+      </w:r>
+      <w:r>
+        <w:br/>
+      </w:r>
+      <w:r>
+        <w:br/>
+      </w:r>
+      <w:r>
+        <w:rPr>
+          <w:rStyle w:val="VerbatimChar"/>
+        </w:rPr>
+        <w:t xml:space="preserve">Затем выполни его на этом проекте. Сначала покажи план миграции с учётом текущей</w:t>
+      </w:r>
+      <w:r>
+        <w:br/>
+      </w:r>
+      <w:r>
+        <w:rPr>
+          <w:rStyle w:val="VerbatimChar"/>
+        </w:rPr>
+        <w:t xml:space="preserve">версии этого проекта, жди подтверждения перед любыми правками.</w:t>
       </w:r>
     </w:p>
     <w:p>
@@ -6065,52 +7435,37 @@
         <w:pStyle w:val="FirstParagraph"/>
       </w:pPr>
       <w:r>
-        <w:t xml:space="preserve">Миграция точечная по разделам (Caddy, push-deploy, Server Actions, Biome, Content Collections и т.д.) — можно делать любое подмножество, не обязательно всё сразу. Подробности в</w:t>
-      </w:r>
-      <w:r>
-        <w:t xml:space="preserve"> </w:t>
-      </w:r>
-      <w:r>
-        <w:rPr>
-          <w:rStyle w:val="VerbatimChar"/>
-        </w:rPr>
-        <w:t xml:space="preserve">_BUILD/v3/02-migrate-existing-project.md</w:t>
-      </w:r>
-      <w:r>
-        <w:t xml:space="preserve">.</w:t>
-      </w:r>
-    </w:p>
-    <w:bookmarkEnd w:id="37"/>
-    <w:bookmarkStart w:id="38" w:name="Xfc8567ad681f6c2e6d5634544536a7a636ce006"/>
-    <w:p>
-      <w:pPr>
-        <w:pStyle w:val="Heading2"/>
-      </w:pPr>
-      <w:r>
-        <w:t xml:space="preserve">11. Обновить сам bootstrap (для меня, разработчика)</w:t>
-      </w:r>
-    </w:p>
-    <w:p>
-      <w:pPr>
-        <w:pStyle w:val="FirstParagraph"/>
-      </w:pPr>
-      <w:r>
-        <w:t xml:space="preserve">В папке</w:t>
-      </w:r>
-      <w:r>
-        <w:t xml:space="preserve"> </w:t>
-      </w:r>
-      <w:r>
-        <w:rPr>
-          <w:rStyle w:val="VerbatimChar"/>
-        </w:rPr>
-        <w:t xml:space="preserve">~/ClaudeCode/web-dev-bootstrap</w:t>
-      </w:r>
-      <w:r>
-        <w:t xml:space="preserve"> </w:t>
-      </w:r>
-      <w:r>
-        <w:t xml:space="preserve">— новый чат.</w:t>
+        <w:t xml:space="preserve">Claude через</w:t>
+      </w:r>
+      <w:r>
+        <w:t xml:space="preserve"> </w:t>
+      </w:r>
+      <w:r>
+        <w:rPr>
+          <w:rStyle w:val="VerbatimChar"/>
+        </w:rPr>
+        <w:t xml:space="preserve">WebFetch</w:t>
+      </w:r>
+      <w:r>
+        <w:t xml:space="preserve"> </w:t>
+      </w:r>
+      <w:r>
+        <w:t xml:space="preserve">или</w:t>
+      </w:r>
+      <w:r>
+        <w:t xml:space="preserve"> </w:t>
+      </w:r>
+      <w:r>
+        <w:rPr>
+          <w:rStyle w:val="VerbatimChar"/>
+        </w:rPr>
+        <w:t xml:space="preserve">curl</w:t>
+      </w:r>
+      <w:r>
+        <w:t xml:space="preserve"> </w:t>
+      </w:r>
+      <w:r>
+        <w:t xml:space="preserve">прочитает ТЗ-2, дальше:</w:t>
       </w:r>
     </w:p>
     <w:p>
@@ -6122,41 +7477,22 @@
         </w:numPr>
       </w:pPr>
       <w:r>
-        <w:rPr>
-          <w:b/>
-          <w:bCs/>
-        </w:rPr>
-        <w:t xml:space="preserve">Если рефакторишь bootstrap по большому ТЗ</w:t>
-      </w:r>
-      <w:r>
-        <w:t xml:space="preserve"> </w:t>
-      </w:r>
-      <w:r>
-        <w:t xml:space="preserve">(типа</w:t>
-      </w:r>
-      <w:r>
-        <w:t xml:space="preserve"> </w:t>
-      </w:r>
-      <w:r>
-        <w:rPr>
-          <w:rStyle w:val="VerbatimChar"/>
-        </w:rPr>
-        <w:t xml:space="preserve">_BUILD/v3/01-bootstrap-refactor.md</w:t>
-      </w:r>
-      <w:r>
-        <w:t xml:space="preserve">) — стартовый промпт описан в начале самого ТЗ. Память bootstrap’а сама помнит активную фазу через</w:t>
-      </w:r>
-      <w:r>
-        <w:t xml:space="preserve"> </w:t>
-      </w:r>
-      <w:r>
-        <w:rPr>
-          <w:rStyle w:val="VerbatimChar"/>
-        </w:rPr>
-        <w:t xml:space="preserve">.claude/memory/project_state.md</w:t>
-      </w:r>
-      <w:r>
-        <w:t xml:space="preserve">.</w:t>
+        <w:t xml:space="preserve">Определит текущую версию проекта (по</w:t>
+      </w:r>
+      <w:r>
+        <w:t xml:space="preserve"> </w:t>
+      </w:r>
+      <w:r>
+        <w:rPr>
+          <w:rStyle w:val="VerbatimChar"/>
+        </w:rPr>
+        <w:t xml:space="preserve">_BUILD/changelog.md</w:t>
+      </w:r>
+      <w:r>
+        <w:t xml:space="preserve"> </w:t>
+      </w:r>
+      <w:r>
+        <w:t xml:space="preserve">или признакам)</w:t>
       </w:r>
     </w:p>
     <w:p>
@@ -6168,32 +7504,84 @@
         </w:numPr>
       </w:pPr>
       <w:r>
+        <w:t xml:space="preserve">Сделает pre-flight:</w:t>
+      </w:r>
+      <w:r>
+        <w:t xml:space="preserve"> </w:t>
+      </w:r>
+      <w:r>
+        <w:rPr>
+          <w:rStyle w:val="VerbatimChar"/>
+        </w:rPr>
+        <w:t xml:space="preserve">git status</w:t>
+      </w:r>
+      <w:r>
+        <w:t xml:space="preserve">, поставит</w:t>
+      </w:r>
+      <w:r>
+        <w:t xml:space="preserve"> </w:t>
+      </w:r>
+      <w:r>
+        <w:rPr>
+          <w:rStyle w:val="VerbatimChar"/>
+        </w:rPr>
+        <w:t xml:space="preserve">pre-v3-migration-YYYYMMDD</w:t>
+      </w:r>
+      <w:r>
+        <w:t xml:space="preserve"> </w:t>
+      </w:r>
+      <w:r>
+        <w:t xml:space="preserve">тег для отката</w:t>
+      </w:r>
+    </w:p>
+    <w:p>
+      <w:pPr>
+        <w:pStyle w:val="Compact"/>
+        <w:numPr>
+          <w:ilvl w:val="0"/>
+          <w:numId w:val="1016"/>
+        </w:numPr>
+      </w:pPr>
+      <w:r>
+        <w:t xml:space="preserve">Покажет</w:t>
+      </w:r>
+      <w:r>
+        <w:t xml:space="preserve"> </w:t>
+      </w:r>
+      <w:r>
         <w:rPr>
           <w:b/>
           <w:bCs/>
         </w:rPr>
-        <w:t xml:space="preserve">Если просто точечная правка</w:t>
-      </w:r>
-      <w:r>
-        <w:t xml:space="preserve"> </w:t>
-      </w:r>
-      <w:r>
-        <w:t xml:space="preserve">—</w:t>
-      </w:r>
-      <w:r>
-        <w:t xml:space="preserve"> </w:t>
-      </w:r>
-      <w:r>
-        <w:rPr>
-          <w:rStyle w:val="VerbatimChar"/>
-        </w:rPr>
-        <w:t xml:space="preserve">/resume</w:t>
-      </w:r>
-      <w:r>
-        <w:t xml:space="preserve"> </w:t>
-      </w:r>
-      <w:r>
-        <w:t xml:space="preserve">или прямой промпт «улучшить шаблон в [файл]: [описание]».</w:t>
+        <w:t xml:space="preserve">персональный план миграции</w:t>
+      </w:r>
+      <w:r>
+        <w:t xml:space="preserve"> </w:t>
+      </w:r>
+      <w:r>
+        <w:t xml:space="preserve">под этот конкретный проект — жди ОК</w:t>
+      </w:r>
+    </w:p>
+    <w:p>
+      <w:pPr>
+        <w:pStyle w:val="Compact"/>
+        <w:numPr>
+          <w:ilvl w:val="0"/>
+          <w:numId w:val="1016"/>
+        </w:numPr>
+      </w:pPr>
+      <w:r>
+        <w:t xml:space="preserve">Только после твоего подтверждения начнёт правки</w:t>
+      </w:r>
+    </w:p>
+    <w:bookmarkEnd w:id="42"/>
+    <w:bookmarkStart w:id="43" w:name="если-миграция-не-вся-а-точечная"/>
+    <w:p>
+      <w:pPr>
+        <w:pStyle w:val="Heading3"/>
+      </w:pPr>
+      <w:r>
+        <w:t xml:space="preserve">Если миграция не вся, а точечная</w:t>
       </w:r>
     </w:p>
     <w:p>
@@ -6201,90 +7589,229 @@
         <w:pStyle w:val="FirstParagraph"/>
       </w:pPr>
       <w:r>
-        <w:t xml:space="preserve">Изменения коммитятся в feature-ветку, мёрджатся PR в</w:t>
-      </w:r>
-      <w:r>
-        <w:t xml:space="preserve"> </w:t>
-      </w:r>
-      <w:r>
-        <w:rPr>
-          <w:rStyle w:val="VerbatimChar"/>
-        </w:rPr>
-        <w:t xml:space="preserve">main</w:t>
-      </w:r>
-      <w:r>
-        <w:t xml:space="preserve"> </w:t>
-      </w:r>
-      <w:r>
-        <w:t xml:space="preserve">через</w:t>
-      </w:r>
-      <w:r>
-        <w:t xml:space="preserve"> </w:t>
-      </w:r>
-      <w:r>
-        <w:rPr>
-          <w:rStyle w:val="VerbatimChar"/>
-        </w:rPr>
-        <w:t xml:space="preserve">gh pr merge --squash</w:t>
-      </w:r>
-      <w:r>
-        <w:t xml:space="preserve">, ставится семвер-тег (</w:t>
-      </w:r>
-      <w:r>
-        <w:rPr>
-          <w:rStyle w:val="VerbatimChar"/>
-        </w:rPr>
-        <w:t xml:space="preserve">v3.0.x</w:t>
-      </w:r>
-      <w:r>
-        <w:t xml:space="preserve">,</w:t>
-      </w:r>
-      <w:r>
-        <w:t xml:space="preserve"> </w:t>
-      </w:r>
-      <w:r>
-        <w:rPr>
-          <w:rStyle w:val="VerbatimChar"/>
-        </w:rPr>
-        <w:t xml:space="preserve">v3.1</w:t>
-      </w:r>
-      <w:r>
-        <w:t xml:space="preserve"> </w:t>
-      </w:r>
-      <w:r>
-        <w:t xml:space="preserve">и т.д.) и запись в</w:t>
-      </w:r>
-      <w:r>
-        <w:t xml:space="preserve"> </w:t>
-      </w:r>
-      <w:r>
-        <w:rPr>
-          <w:rStyle w:val="VerbatimChar"/>
-        </w:rPr>
-        <w:t xml:space="preserve">_BUILD/changelog.md</w:t>
-      </w:r>
-      <w:r>
-        <w:t xml:space="preserve"> </w:t>
-      </w:r>
-      <w:r>
-        <w:t xml:space="preserve">сверху.</w:t>
-      </w:r>
-    </w:p>
-    <w:p>
-      <w:r>
-        <w:pict>
-          <v:rect style="width:0;height:1.5pt" o:hralign="center" o:hrstd="t" o:hr="t"/>
-        </w:pict>
-      </w:r>
-    </w:p>
-    <w:bookmarkEnd w:id="38"/>
-    <w:bookmarkStart w:id="39" w:name="частые-косяки"/>
+        <w:t xml:space="preserve">Миграция модульная: можно делать</w:t>
+      </w:r>
+      <w:r>
+        <w:t xml:space="preserve"> </w:t>
+      </w:r>
+      <w:r>
+        <w:rPr>
+          <w:b/>
+          <w:bCs/>
+        </w:rPr>
+        <w:t xml:space="preserve">любое подмножество</w:t>
+      </w:r>
+      <w:r>
+        <w:t xml:space="preserve"> </w:t>
+      </w:r>
+      <w:r>
+        <w:t xml:space="preserve">этапов, не обязательно всё сразу. Например, только tooling (pnpm + Biome + mise) без deploy-миграции. Скажи Claude в начале:</w:t>
+      </w:r>
+    </w:p>
+    <w:p>
+      <w:pPr>
+        <w:pStyle w:val="SourceCode"/>
+      </w:pPr>
+      <w:r>
+        <w:rPr>
+          <w:rStyle w:val="VerbatimChar"/>
+        </w:rPr>
+        <w:t xml:space="preserve">Хочу мигрировать только этапы 2 (tooling: mise + pnpm + Biome) и 5 (.claude/ обновления).</w:t>
+      </w:r>
+      <w:r>
+        <w:br/>
+      </w:r>
+      <w:r>
+        <w:rPr>
+          <w:rStyle w:val="VerbatimChar"/>
+        </w:rPr>
+        <w:t xml:space="preserve">Этапы 3 (код), 4 (deploy) и 6 (Caddy) пропусти.</w:t>
+      </w:r>
+    </w:p>
+    <w:p>
+      <w:pPr>
+        <w:pStyle w:val="FirstParagraph"/>
+      </w:pPr>
+      <w:r>
+        <w:t xml:space="preserve">Claude построит план только под выбранные этапы.</w:t>
+      </w:r>
+    </w:p>
+    <w:bookmarkEnd w:id="43"/>
+    <w:bookmarkStart w:id="44" w:name="опционально-локальная-копия-bootstrapа"/>
+    <w:p>
+      <w:pPr>
+        <w:pStyle w:val="Heading3"/>
+      </w:pPr>
+      <w:r>
+        <w:t xml:space="preserve">Опционально: локальная копия bootstrap’а</w:t>
+      </w:r>
+    </w:p>
+    <w:p>
+      <w:pPr>
+        <w:pStyle w:val="FirstParagraph"/>
+      </w:pPr>
+      <w:r>
+        <w:t xml:space="preserve">Если хочешь работать offline или просто чтобы быстрее (без сетевых запросов к GitHub на каждый</w:t>
+      </w:r>
+      <w:r>
+        <w:t xml:space="preserve"> </w:t>
+      </w:r>
+      <w:r>
+        <w:rPr>
+          <w:rStyle w:val="VerbatimChar"/>
+        </w:rPr>
+        <w:t xml:space="preserve">cp</w:t>
+      </w:r>
+      <w:r>
+        <w:t xml:space="preserve">) — клонируй bootstrap локально один раз:</w:t>
+      </w:r>
+    </w:p>
+    <w:p>
+      <w:pPr>
+        <w:pStyle w:val="SourceCode"/>
+      </w:pPr>
+      <w:r>
+        <w:rPr>
+          <w:rStyle w:val="FunctionTok"/>
+        </w:rPr>
+        <w:t xml:space="preserve">mkdir</w:t>
+      </w:r>
+      <w:r>
+        <w:rPr>
+          <w:rStyle w:val="NormalTok"/>
+        </w:rPr>
+        <w:t xml:space="preserve"> </w:t>
+      </w:r>
+      <w:r>
+        <w:rPr>
+          <w:rStyle w:val="AttributeTok"/>
+        </w:rPr>
+        <w:t xml:space="preserve">-p</w:t>
+      </w:r>
+      <w:r>
+        <w:rPr>
+          <w:rStyle w:val="NormalTok"/>
+        </w:rPr>
+        <w:t xml:space="preserve"> ~/ClaudeCode</w:t>
+      </w:r>
+      <w:r>
+        <w:br/>
+      </w:r>
+      <w:r>
+        <w:rPr>
+          <w:rStyle w:val="FunctionTok"/>
+        </w:rPr>
+        <w:t xml:space="preserve">git</w:t>
+      </w:r>
+      <w:r>
+        <w:rPr>
+          <w:rStyle w:val="NormalTok"/>
+        </w:rPr>
+        <w:t xml:space="preserve"> clone </w:t>
+      </w:r>
+      <w:r>
+        <w:rPr>
+          <w:rStyle w:val="AttributeTok"/>
+        </w:rPr>
+        <w:t xml:space="preserve">--branch</w:t>
+      </w:r>
+      <w:r>
+        <w:rPr>
+          <w:rStyle w:val="NormalTok"/>
+        </w:rPr>
+        <w:t xml:space="preserve"> v3.0 https://github.com/tem11134v2-cmd/web-dev-bootstrap.git </w:t>
+      </w:r>
+      <w:r>
+        <w:rPr>
+          <w:rStyle w:val="DataTypeTok"/>
+        </w:rPr>
+        <w:t xml:space="preserve">\</w:t>
+      </w:r>
+      <w:r>
+        <w:br/>
+      </w:r>
+      <w:r>
+        <w:rPr>
+          <w:rStyle w:val="NormalTok"/>
+        </w:rPr>
+        <w:t xml:space="preserve">  ~/ClaudeCode/web-dev-bootstrap</w:t>
+      </w:r>
+    </w:p>
+    <w:p>
+      <w:pPr>
+        <w:pStyle w:val="FirstParagraph"/>
+      </w:pPr>
+      <w:r>
+        <w:t xml:space="preserve">Дальше ТЗ-2 автоматически использует локальные файлы. Обновлять локальную копию:</w:t>
+      </w:r>
+      <w:r>
+        <w:t xml:space="preserve"> </w:t>
+      </w:r>
+      <w:r>
+        <w:rPr>
+          <w:rStyle w:val="VerbatimChar"/>
+        </w:rPr>
+        <w:t xml:space="preserve">cd ~/ClaudeCode/web-dev-bootstrap &amp;&amp; git fetch --tags &amp;&amp; git checkout v3.0</w:t>
+      </w:r>
+      <w:r>
+        <w:t xml:space="preserve"> </w:t>
+      </w:r>
+      <w:r>
+        <w:t xml:space="preserve">(или другой свежий тег, когда выйдет v3.x).</w:t>
+      </w:r>
+    </w:p>
+    <w:p>
+      <w:pPr>
+        <w:pStyle w:val="BodyText"/>
+      </w:pPr>
+      <w:r>
+        <w:t xml:space="preserve">Подробности всех 6 этапов миграции — в самом ТЗ-2 (</w:t>
+      </w:r>
+      <w:r>
+        <w:rPr>
+          <w:rStyle w:val="VerbatimChar"/>
+        </w:rPr>
+        <w:t xml:space="preserve">_BUILD/v3/02-migrate-existing-project.md</w:t>
+      </w:r>
+      <w:r>
+        <w:t xml:space="preserve"> </w:t>
+      </w:r>
+      <w:r>
+        <w:t xml:space="preserve">в репо bootstrap’а).</w:t>
+      </w:r>
+    </w:p>
+    <w:bookmarkEnd w:id="44"/>
+    <w:bookmarkEnd w:id="45"/>
+    <w:bookmarkStart w:id="46" w:name="Xfc8567ad681f6c2e6d5634544536a7a636ce006"/>
     <w:p>
       <w:pPr>
         <w:pStyle w:val="Heading2"/>
       </w:pPr>
       <w:r>
-        <w:t xml:space="preserve">Частые косяки</w:t>
+        <w:t xml:space="preserve">11. Обновить сам bootstrap (для меня, разработчика)</w:t>
+      </w:r>
+    </w:p>
+    <w:p>
+      <w:pPr>
+        <w:pStyle w:val="FirstParagraph"/>
+      </w:pPr>
+      <w:r>
+        <w:t xml:space="preserve">В папке</w:t>
+      </w:r>
+      <w:r>
+        <w:t xml:space="preserve"> </w:t>
+      </w:r>
+      <w:r>
+        <w:rPr>
+          <w:rStyle w:val="VerbatimChar"/>
+        </w:rPr>
+        <w:t xml:space="preserve">~/ClaudeCode/web-dev-bootstrap</w:t>
+      </w:r>
+      <w:r>
+        <w:t xml:space="preserve"> </w:t>
+      </w:r>
+      <w:r>
+        <w:t xml:space="preserve">— новый чат.</w:t>
       </w:r>
     </w:p>
     <w:p>
@@ -6297,26 +7824,37 @@
       </w:pPr>
       <w:r>
         <w:rPr>
-          <w:rStyle w:val="VerbatimChar"/>
           <w:b/>
           <w:bCs/>
         </w:rPr>
-        <w:t xml:space="preserve">gh: command not found</w:t>
-      </w:r>
-      <w:r>
-        <w:t xml:space="preserve"> </w:t>
-      </w:r>
-      <w:r>
-        <w:t xml:space="preserve">— открой новое окно Terminal или</w:t>
-      </w:r>
-      <w:r>
-        <w:t xml:space="preserve"> </w:t>
-      </w:r>
-      <w:r>
-        <w:rPr>
-          <w:rStyle w:val="VerbatimChar"/>
-        </w:rPr>
-        <w:t xml:space="preserve">source ~/.zprofile</w:t>
+        <w:t xml:space="preserve">Если рефакторишь bootstrap по большому ТЗ</w:t>
+      </w:r>
+      <w:r>
+        <w:t xml:space="preserve"> </w:t>
+      </w:r>
+      <w:r>
+        <w:t xml:space="preserve">(типа</w:t>
+      </w:r>
+      <w:r>
+        <w:t xml:space="preserve"> </w:t>
+      </w:r>
+      <w:r>
+        <w:rPr>
+          <w:rStyle w:val="VerbatimChar"/>
+        </w:rPr>
+        <w:t xml:space="preserve">_BUILD/v3/01-bootstrap-refactor.md</w:t>
+      </w:r>
+      <w:r>
+        <w:t xml:space="preserve">) — стартовый промпт описан в начале самого ТЗ. Память bootstrap’а сама помнит активную фазу через</w:t>
+      </w:r>
+      <w:r>
+        <w:t xml:space="preserve"> </w:t>
+      </w:r>
+      <w:r>
+        <w:rPr>
+          <w:rStyle w:val="VerbatimChar"/>
+        </w:rPr>
+        <w:t xml:space="preserve">.claude/memory/project_state.md</w:t>
       </w:r>
       <w:r>
         <w:t xml:space="preserve">.</w:t>
@@ -6335,7 +7873,7 @@
           <w:b/>
           <w:bCs/>
         </w:rPr>
-        <w:t xml:space="preserve">«Папка проекта не видна в Claude Desktop»</w:t>
+        <w:t xml:space="preserve">Если просто точечная правка</w:t>
       </w:r>
       <w:r>
         <w:t xml:space="preserve"> </w:t>
@@ -6350,37 +7888,104 @@
         <w:rPr>
           <w:rStyle w:val="VerbatimChar"/>
         </w:rPr>
-        <w:t xml:space="preserve">Select folder</w:t>
-      </w:r>
-      <w:r>
-        <w:t xml:space="preserve"> </w:t>
-      </w:r>
-      <w:r>
-        <w:t xml:space="preserve">(не</w:t>
-      </w:r>
-      <w:r>
-        <w:t xml:space="preserve"> </w:t>
-      </w:r>
-      <w:r>
-        <w:rPr>
-          <w:rStyle w:val="VerbatimChar"/>
-        </w:rPr>
-        <w:t xml:space="preserve">Select file</w:t>
-      </w:r>
-      <w:r>
-        <w:t xml:space="preserve">), и проверь что выбрал</w:t>
-      </w:r>
-      <w:r>
-        <w:t xml:space="preserve"> </w:t>
-      </w:r>
-      <w:r>
-        <w:rPr>
-          <w:rStyle w:val="VerbatimChar"/>
-        </w:rPr>
-        <w:t xml:space="preserve">~/projects/{site}</w:t>
-      </w:r>
-      <w:r>
-        <w:t xml:space="preserve">, а не родитель.</w:t>
+        <w:t xml:space="preserve">/resume</w:t>
+      </w:r>
+      <w:r>
+        <w:t xml:space="preserve"> </w:t>
+      </w:r>
+      <w:r>
+        <w:t xml:space="preserve">или прямой промпт «улучшить шаблон в [файл]: [описание]».</w:t>
+      </w:r>
+    </w:p>
+    <w:p>
+      <w:pPr>
+        <w:pStyle w:val="FirstParagraph"/>
+      </w:pPr>
+      <w:r>
+        <w:t xml:space="preserve">Изменения коммитятся в feature-ветку, мёрджатся PR в</w:t>
+      </w:r>
+      <w:r>
+        <w:t xml:space="preserve"> </w:t>
+      </w:r>
+      <w:r>
+        <w:rPr>
+          <w:rStyle w:val="VerbatimChar"/>
+        </w:rPr>
+        <w:t xml:space="preserve">main</w:t>
+      </w:r>
+      <w:r>
+        <w:t xml:space="preserve"> </w:t>
+      </w:r>
+      <w:r>
+        <w:t xml:space="preserve">через</w:t>
+      </w:r>
+      <w:r>
+        <w:t xml:space="preserve"> </w:t>
+      </w:r>
+      <w:r>
+        <w:rPr>
+          <w:rStyle w:val="VerbatimChar"/>
+        </w:rPr>
+        <w:t xml:space="preserve">gh pr merge --squash</w:t>
+      </w:r>
+      <w:r>
+        <w:t xml:space="preserve">, ставится семвер-тег (</w:t>
+      </w:r>
+      <w:r>
+        <w:rPr>
+          <w:rStyle w:val="VerbatimChar"/>
+        </w:rPr>
+        <w:t xml:space="preserve">v3.0.x</w:t>
+      </w:r>
+      <w:r>
+        <w:t xml:space="preserve">,</w:t>
+      </w:r>
+      <w:r>
+        <w:t xml:space="preserve"> </w:t>
+      </w:r>
+      <w:r>
+        <w:rPr>
+          <w:rStyle w:val="VerbatimChar"/>
+        </w:rPr>
+        <w:t xml:space="preserve">v3.1</w:t>
+      </w:r>
+      <w:r>
+        <w:t xml:space="preserve"> </w:t>
+      </w:r>
+      <w:r>
+        <w:t xml:space="preserve">и т.д.) и запись в</w:t>
+      </w:r>
+      <w:r>
+        <w:t xml:space="preserve"> </w:t>
+      </w:r>
+      <w:r>
+        <w:rPr>
+          <w:rStyle w:val="VerbatimChar"/>
+        </w:rPr>
+        <w:t xml:space="preserve">_BUILD/changelog.md</w:t>
+      </w:r>
+      <w:r>
+        <w:t xml:space="preserve"> </w:t>
+      </w:r>
+      <w:r>
+        <w:t xml:space="preserve">сверху.</w:t>
+      </w:r>
+    </w:p>
+    <w:p>
+      <w:r>
+        <w:pict>
+          <v:rect style="width:0;height:1.5pt" o:hralign="center" o:hrstd="t" o:hr="t"/>
+        </w:pict>
+      </w:r>
+    </w:p>
+    <w:bookmarkEnd w:id="46"/>
+    <w:bookmarkStart w:id="47" w:name="частые-косяки"/>
+    <w:p>
+      <w:pPr>
+        <w:pStyle w:val="Heading2"/>
+      </w:pPr>
+      <w:r>
+        <w:t xml:space="preserve">Частые косяки</w:t>
       </w:r>
     </w:p>
     <w:p>
@@ -6388,33 +7993,34 @@
         <w:pStyle w:val="Compact"/>
         <w:numPr>
           <w:ilvl w:val="0"/>
-          <w:numId w:val="1017"/>
+          <w:numId w:val="1018"/>
         </w:numPr>
       </w:pPr>
       <w:r>
         <w:rPr>
+          <w:rStyle w:val="VerbatimChar"/>
           <w:b/>
           <w:bCs/>
         </w:rPr>
-        <w:t xml:space="preserve">Claude пишет «я не вижу файлов»</w:t>
-      </w:r>
-      <w:r>
-        <w:t xml:space="preserve"> </w:t>
-      </w:r>
-      <w:r>
-        <w:t xml:space="preserve">— он ещё не прочитал</w:t>
-      </w:r>
-      <w:r>
-        <w:t xml:space="preserve"> </w:t>
-      </w:r>
-      <w:r>
-        <w:rPr>
-          <w:rStyle w:val="VerbatimChar"/>
-        </w:rPr>
-        <w:t xml:space="preserve">CLAUDE.md</w:t>
-      </w:r>
-      <w:r>
-        <w:t xml:space="preserve">. Отправь промпт из §3.</w:t>
+        <w:t xml:space="preserve">gh: command not found</w:t>
+      </w:r>
+      <w:r>
+        <w:t xml:space="preserve"> </w:t>
+      </w:r>
+      <w:r>
+        <w:t xml:space="preserve">— открой новое окно Terminal или</w:t>
+      </w:r>
+      <w:r>
+        <w:t xml:space="preserve"> </w:t>
+      </w:r>
+      <w:r>
+        <w:rPr>
+          <w:rStyle w:val="VerbatimChar"/>
+        </w:rPr>
+        <w:t xml:space="preserve">source ~/.zprofile</w:t>
+      </w:r>
+      <w:r>
+        <w:t xml:space="preserve">.</w:t>
       </w:r>
     </w:p>
     <w:p>
@@ -6422,36 +8028,60 @@
         <w:pStyle w:val="Compact"/>
         <w:numPr>
           <w:ilvl w:val="0"/>
-          <w:numId w:val="1017"/>
+          <w:numId w:val="1018"/>
         </w:numPr>
       </w:pPr>
       <w:r>
         <w:rPr>
-          <w:rStyle w:val="VerbatimChar"/>
           <w:b/>
           <w:bCs/>
         </w:rPr>
-        <w:t xml:space="preserve">gh repo create</w:t>
-      </w:r>
-      <w:r>
-        <w:rPr>
-          <w:b/>
-          <w:bCs/>
-        </w:rPr>
-        <w:t xml:space="preserve"> </w:t>
-      </w:r>
-      <w:r>
-        <w:rPr>
-          <w:b/>
-          <w:bCs/>
-        </w:rPr>
-        <w:t xml:space="preserve">→ «already exists»</w:t>
-      </w:r>
-      <w:r>
-        <w:t xml:space="preserve"> </w:t>
-      </w:r>
-      <w:r>
-        <w:t xml:space="preserve">— выбери другое имя или удали старый в Settings репо.</w:t>
+        <w:t xml:space="preserve">«Папка проекта не видна в Claude Desktop»</w:t>
+      </w:r>
+      <w:r>
+        <w:t xml:space="preserve"> </w:t>
+      </w:r>
+      <w:r>
+        <w:t xml:space="preserve">—</w:t>
+      </w:r>
+      <w:r>
+        <w:t xml:space="preserve"> </w:t>
+      </w:r>
+      <w:r>
+        <w:rPr>
+          <w:rStyle w:val="VerbatimChar"/>
+        </w:rPr>
+        <w:t xml:space="preserve">Select folder</w:t>
+      </w:r>
+      <w:r>
+        <w:t xml:space="preserve"> </w:t>
+      </w:r>
+      <w:r>
+        <w:t xml:space="preserve">(не</w:t>
+      </w:r>
+      <w:r>
+        <w:t xml:space="preserve"> </w:t>
+      </w:r>
+      <w:r>
+        <w:rPr>
+          <w:rStyle w:val="VerbatimChar"/>
+        </w:rPr>
+        <w:t xml:space="preserve">Select file</w:t>
+      </w:r>
+      <w:r>
+        <w:t xml:space="preserve">), и проверь что выбрал</w:t>
+      </w:r>
+      <w:r>
+        <w:t xml:space="preserve"> </w:t>
+      </w:r>
+      <w:r>
+        <w:rPr>
+          <w:rStyle w:val="VerbatimChar"/>
+        </w:rPr>
+        <w:t xml:space="preserve">~/projects/{site}</w:t>
+      </w:r>
+      <w:r>
+        <w:t xml:space="preserve">, а не родитель.</w:t>
       </w:r>
     </w:p>
     <w:p>
@@ -6459,7 +8089,7 @@
         <w:pStyle w:val="Compact"/>
         <w:numPr>
           <w:ilvl w:val="0"/>
-          <w:numId w:val="1017"/>
+          <w:numId w:val="1018"/>
         </w:numPr>
       </w:pPr>
       <w:r>
@@ -6467,25 +8097,25 @@
           <w:b/>
           <w:bCs/>
         </w:rPr>
-        <w:t xml:space="preserve">Хук блокирует push: «BLOCKED by before-push: gh account mismatch»</w:t>
-      </w:r>
-      <w:r>
-        <w:t xml:space="preserve"> </w:t>
-      </w:r>
-      <w:r>
-        <w:t xml:space="preserve">— у тебя залогинено несколько gh-аккаунтов, активный — не тот. Команда из сообщения хука:</w:t>
-      </w:r>
-      <w:r>
-        <w:t xml:space="preserve"> </w:t>
-      </w:r>
-      <w:r>
-        <w:rPr>
-          <w:rStyle w:val="VerbatimChar"/>
-        </w:rPr>
-        <w:t xml:space="preserve">gh auth switch -h github.com -u &lt;owner&gt;</w:t>
-      </w:r>
-      <w:r>
-        <w:t xml:space="preserve">. После — повтори push.</w:t>
+        <w:t xml:space="preserve">Claude пишет «я не вижу файлов»</w:t>
+      </w:r>
+      <w:r>
+        <w:t xml:space="preserve"> </w:t>
+      </w:r>
+      <w:r>
+        <w:t xml:space="preserve">— он ещё не прочитал</w:t>
+      </w:r>
+      <w:r>
+        <w:t xml:space="preserve"> </w:t>
+      </w:r>
+      <w:r>
+        <w:rPr>
+          <w:rStyle w:val="VerbatimChar"/>
+        </w:rPr>
+        <w:t xml:space="preserve">CLAUDE.md</w:t>
+      </w:r>
+      <w:r>
+        <w:t xml:space="preserve">. Отправь промпт из §3.</w:t>
       </w:r>
     </w:p>
     <w:p>
@@ -6493,66 +8123,36 @@
         <w:pStyle w:val="Compact"/>
         <w:numPr>
           <w:ilvl w:val="0"/>
-          <w:numId w:val="1017"/>
+          <w:numId w:val="1018"/>
         </w:numPr>
       </w:pPr>
       <w:r>
         <w:rPr>
+          <w:rStyle w:val="VerbatimChar"/>
           <w:b/>
           <w:bCs/>
         </w:rPr>
-        <w:t xml:space="preserve">Smoke-тест домена возвращает 301 от ddos-guard до DNS cutover</w:t>
-      </w:r>
-      <w:r>
-        <w:t xml:space="preserve"> </w:t>
-      </w:r>
-      <w:r>
-        <w:t xml:space="preserve">— middlebox перехватывает Host-header. Используй</w:t>
-      </w:r>
-      <w:r>
-        <w:t xml:space="preserve"> </w:t>
-      </w:r>
-      <w:r>
-        <w:rPr>
-          <w:rStyle w:val="VerbatimChar"/>
-        </w:rPr>
-        <w:t xml:space="preserve">Host: &lt;IP&gt;</w:t>
-      </w:r>
-      <w:r>
-        <w:t xml:space="preserve"> </w:t>
-      </w:r>
-      <w:r>
-        <w:t xml:space="preserve">или</w:t>
-      </w:r>
-      <w:r>
-        <w:t xml:space="preserve"> </w:t>
-      </w:r>
-      <w:r>
-        <w:rPr>
-          <w:rStyle w:val="VerbatimChar"/>
-        </w:rPr>
-        <w:t xml:space="preserve">/etc/hosts</w:t>
-      </w:r>
-      <w:r>
-        <w:t xml:space="preserve"> </w:t>
-      </w:r>
-      <w:r>
-        <w:t xml:space="preserve">override. Подробно в</w:t>
-      </w:r>
-      <w:r>
-        <w:t xml:space="preserve"> </w:t>
-      </w:r>
-      <w:r>
-        <w:rPr>
-          <w:rStyle w:val="VerbatimChar"/>
-        </w:rPr>
-        <w:t xml:space="preserve">docs/troubleshooting.md</w:t>
-      </w:r>
-      <w:r>
-        <w:t xml:space="preserve"> </w:t>
-      </w:r>
-      <w:r>
-        <w:t xml:space="preserve">в шаблоне.</w:t>
+        <w:t xml:space="preserve">gh repo create</w:t>
+      </w:r>
+      <w:r>
+        <w:rPr>
+          <w:b/>
+          <w:bCs/>
+        </w:rPr>
+        <w:t xml:space="preserve"> </w:t>
+      </w:r>
+      <w:r>
+        <w:rPr>
+          <w:b/>
+          <w:bCs/>
+        </w:rPr>
+        <w:t xml:space="preserve">→ «already exists»</w:t>
+      </w:r>
+      <w:r>
+        <w:t xml:space="preserve"> </w:t>
+      </w:r>
+      <w:r>
+        <w:t xml:space="preserve">— выбери другое имя или удали старый в Settings репо.</w:t>
       </w:r>
     </w:p>
     <w:p>
@@ -6560,48 +8160,33 @@
         <w:pStyle w:val="Compact"/>
         <w:numPr>
           <w:ilvl w:val="0"/>
-          <w:numId w:val="1017"/>
+          <w:numId w:val="1018"/>
         </w:numPr>
       </w:pPr>
       <w:r>
         <w:rPr>
-          <w:rStyle w:val="VerbatimChar"/>
           <w:b/>
           <w:bCs/>
         </w:rPr>
-        <w:t xml:space="preserve">git revert</w:t>
-      </w:r>
-      <w:r>
-        <w:rPr>
-          <w:b/>
-          <w:bCs/>
-        </w:rPr>
-        <w:t xml:space="preserve"> </w:t>
-      </w:r>
-      <w:r>
-        <w:rPr>
-          <w:b/>
-          <w:bCs/>
-        </w:rPr>
-        <w:t xml:space="preserve">падает «commit has more than one parent»</w:t>
-      </w:r>
-      <w:r>
-        <w:t xml:space="preserve"> </w:t>
-      </w:r>
-      <w:r>
-        <w:t xml:space="preserve">— это merge-коммит (PR merge). Используй</w:t>
-      </w:r>
-      <w:r>
-        <w:t xml:space="preserve"> </w:t>
-      </w:r>
-      <w:r>
-        <w:rPr>
-          <w:rStyle w:val="VerbatimChar"/>
-        </w:rPr>
-        <w:t xml:space="preserve">git revert -m 1 &lt;hash&gt;</w:t>
-      </w:r>
-      <w:r>
-        <w:t xml:space="preserve">.</w:t>
+        <w:t xml:space="preserve">Хук блокирует push: «BLOCKED by before-push: gh account mismatch»</w:t>
+      </w:r>
+      <w:r>
+        <w:t xml:space="preserve"> </w:t>
+      </w:r>
+      <w:r>
+        <w:t xml:space="preserve">— у тебя залогинено несколько gh-аккаунтов, активный — не тот. Команда из сообщения хука:</w:t>
+      </w:r>
+      <w:r>
+        <w:t xml:space="preserve"> </w:t>
+      </w:r>
+      <w:r>
+        <w:rPr>
+          <w:rStyle w:val="VerbatimChar"/>
+        </w:rPr>
+        <w:t xml:space="preserve">gh auth switch -h github.com -u &lt;owner&gt;</w:t>
+      </w:r>
+      <w:r>
+        <w:t xml:space="preserve">. После — повтори push.</w:t>
       </w:r>
     </w:p>
     <w:p>
@@ -6609,7 +8194,7 @@
         <w:pStyle w:val="Compact"/>
         <w:numPr>
           <w:ilvl w:val="0"/>
-          <w:numId w:val="1017"/>
+          <w:numId w:val="1018"/>
         </w:numPr>
       </w:pPr>
       <w:r>
@@ -6617,28 +8202,58 @@
           <w:b/>
           <w:bCs/>
         </w:rPr>
-        <w:t xml:space="preserve">Branch protection возвращает 403 «Upgrade to GitHub Pro»</w:t>
-      </w:r>
-      <w:r>
-        <w:t xml:space="preserve"> </w:t>
-      </w:r>
-      <w:r>
-        <w:t xml:space="preserve">— на private + free она недоступна. Либо</w:t>
-      </w:r>
-      <w:r>
-        <w:t xml:space="preserve"> </w:t>
-      </w:r>
-      <w:r>
-        <w:rPr>
-          <w:rStyle w:val="VerbatimChar"/>
-        </w:rPr>
-        <w:t xml:space="preserve">gh auth switch</w:t>
-      </w:r>
-      <w:r>
-        <w:t xml:space="preserve"> </w:t>
-      </w:r>
-      <w:r>
-        <w:t xml:space="preserve">на public-репо, либо смирись с дисциплиной (один разработчик = ок).</w:t>
+        <w:t xml:space="preserve">Smoke-тест домена возвращает 301 от ddos-guard до DNS cutover</w:t>
+      </w:r>
+      <w:r>
+        <w:t xml:space="preserve"> </w:t>
+      </w:r>
+      <w:r>
+        <w:t xml:space="preserve">— middlebox перехватывает Host-header. Используй</w:t>
+      </w:r>
+      <w:r>
+        <w:t xml:space="preserve"> </w:t>
+      </w:r>
+      <w:r>
+        <w:rPr>
+          <w:rStyle w:val="VerbatimChar"/>
+        </w:rPr>
+        <w:t xml:space="preserve">Host: &lt;IP&gt;</w:t>
+      </w:r>
+      <w:r>
+        <w:t xml:space="preserve"> </w:t>
+      </w:r>
+      <w:r>
+        <w:t xml:space="preserve">или</w:t>
+      </w:r>
+      <w:r>
+        <w:t xml:space="preserve"> </w:t>
+      </w:r>
+      <w:r>
+        <w:rPr>
+          <w:rStyle w:val="VerbatimChar"/>
+        </w:rPr>
+        <w:t xml:space="preserve">/etc/hosts</w:t>
+      </w:r>
+      <w:r>
+        <w:t xml:space="preserve"> </w:t>
+      </w:r>
+      <w:r>
+        <w:t xml:space="preserve">override. Подробно в</w:t>
+      </w:r>
+      <w:r>
+        <w:t xml:space="preserve"> </w:t>
+      </w:r>
+      <w:r>
+        <w:rPr>
+          <w:rStyle w:val="VerbatimChar"/>
+        </w:rPr>
+        <w:t xml:space="preserve">docs/troubleshooting.md</w:t>
+      </w:r>
+      <w:r>
+        <w:t xml:space="preserve"> </w:t>
+      </w:r>
+      <w:r>
+        <w:t xml:space="preserve">в шаблоне.</w:t>
       </w:r>
     </w:p>
     <w:p>
@@ -6646,48 +8261,48 @@
         <w:pStyle w:val="Compact"/>
         <w:numPr>
           <w:ilvl w:val="0"/>
-          <w:numId w:val="1017"/>
+          <w:numId w:val="1018"/>
         </w:numPr>
       </w:pPr>
       <w:r>
         <w:rPr>
+          <w:rStyle w:val="VerbatimChar"/>
           <w:b/>
           <w:bCs/>
         </w:rPr>
-        <w:t xml:space="preserve">«Claude залип / повторяет круги»</w:t>
-      </w:r>
-      <w:r>
-        <w:t xml:space="preserve"> </w:t>
-      </w:r>
-      <w:r>
-        <w:t xml:space="preserve">—</w:t>
-      </w:r>
-      <w:r>
-        <w:t xml:space="preserve"> </w:t>
-      </w:r>
-      <w:r>
-        <w:rPr>
-          <w:rStyle w:val="VerbatimChar"/>
-        </w:rPr>
-        <w:t xml:space="preserve">/clear</w:t>
-      </w:r>
-      <w:r>
-        <w:t xml:space="preserve"> </w:t>
-      </w:r>
-      <w:r>
-        <w:t xml:space="preserve">→</w:t>
-      </w:r>
-      <w:r>
-        <w:t xml:space="preserve"> </w:t>
-      </w:r>
-      <w:r>
-        <w:rPr>
-          <w:rStyle w:val="VerbatimChar"/>
-        </w:rPr>
-        <w:t xml:space="preserve">/resume</w:t>
-      </w:r>
-      <w:r>
-        <w:t xml:space="preserve">. Свежий 200K-контекст обычно лучше чем починка отравленного.</w:t>
+        <w:t xml:space="preserve">git revert</w:t>
+      </w:r>
+      <w:r>
+        <w:rPr>
+          <w:b/>
+          <w:bCs/>
+        </w:rPr>
+        <w:t xml:space="preserve"> </w:t>
+      </w:r>
+      <w:r>
+        <w:rPr>
+          <w:b/>
+          <w:bCs/>
+        </w:rPr>
+        <w:t xml:space="preserve">падает «commit has more than one parent»</w:t>
+      </w:r>
+      <w:r>
+        <w:t xml:space="preserve"> </w:t>
+      </w:r>
+      <w:r>
+        <w:t xml:space="preserve">— это merge-коммит (PR merge). Используй</w:t>
+      </w:r>
+      <w:r>
+        <w:t xml:space="preserve"> </w:t>
+      </w:r>
+      <w:r>
+        <w:rPr>
+          <w:rStyle w:val="VerbatimChar"/>
+        </w:rPr>
+        <w:t xml:space="preserve">git revert -m 1 &lt;hash&gt;</w:t>
+      </w:r>
+      <w:r>
+        <w:t xml:space="preserve">.</w:t>
       </w:r>
     </w:p>
     <w:p>
@@ -6695,7 +8310,93 @@
         <w:pStyle w:val="Compact"/>
         <w:numPr>
           <w:ilvl w:val="0"/>
-          <w:numId w:val="1017"/>
+          <w:numId w:val="1018"/>
+        </w:numPr>
+      </w:pPr>
+      <w:r>
+        <w:rPr>
+          <w:b/>
+          <w:bCs/>
+        </w:rPr>
+        <w:t xml:space="preserve">Branch protection возвращает 403 «Upgrade to GitHub Pro»</w:t>
+      </w:r>
+      <w:r>
+        <w:t xml:space="preserve"> </w:t>
+      </w:r>
+      <w:r>
+        <w:t xml:space="preserve">— на private + free она недоступна. Либо</w:t>
+      </w:r>
+      <w:r>
+        <w:t xml:space="preserve"> </w:t>
+      </w:r>
+      <w:r>
+        <w:rPr>
+          <w:rStyle w:val="VerbatimChar"/>
+        </w:rPr>
+        <w:t xml:space="preserve">gh auth switch</w:t>
+      </w:r>
+      <w:r>
+        <w:t xml:space="preserve"> </w:t>
+      </w:r>
+      <w:r>
+        <w:t xml:space="preserve">на public-репо, либо смирись с дисциплиной (один разработчик = ок).</w:t>
+      </w:r>
+    </w:p>
+    <w:p>
+      <w:pPr>
+        <w:pStyle w:val="Compact"/>
+        <w:numPr>
+          <w:ilvl w:val="0"/>
+          <w:numId w:val="1018"/>
+        </w:numPr>
+      </w:pPr>
+      <w:r>
+        <w:rPr>
+          <w:b/>
+          <w:bCs/>
+        </w:rPr>
+        <w:t xml:space="preserve">«Claude залип / повторяет круги»</w:t>
+      </w:r>
+      <w:r>
+        <w:t xml:space="preserve"> </w:t>
+      </w:r>
+      <w:r>
+        <w:t xml:space="preserve">—</w:t>
+      </w:r>
+      <w:r>
+        <w:t xml:space="preserve"> </w:t>
+      </w:r>
+      <w:r>
+        <w:rPr>
+          <w:rStyle w:val="VerbatimChar"/>
+        </w:rPr>
+        <w:t xml:space="preserve">/clear</w:t>
+      </w:r>
+      <w:r>
+        <w:t xml:space="preserve"> </w:t>
+      </w:r>
+      <w:r>
+        <w:t xml:space="preserve">→</w:t>
+      </w:r>
+      <w:r>
+        <w:t xml:space="preserve"> </w:t>
+      </w:r>
+      <w:r>
+        <w:rPr>
+          <w:rStyle w:val="VerbatimChar"/>
+        </w:rPr>
+        <w:t xml:space="preserve">/resume</w:t>
+      </w:r>
+      <w:r>
+        <w:t xml:space="preserve">. Свежий 200K-контекст обычно лучше чем починка отравленного.</w:t>
+      </w:r>
+    </w:p>
+    <w:p>
+      <w:pPr>
+        <w:pStyle w:val="Compact"/>
+        <w:numPr>
+          <w:ilvl w:val="0"/>
+          <w:numId w:val="1018"/>
         </w:numPr>
       </w:pPr>
       <w:r>
@@ -6787,8 +8488,8 @@
         </w:pict>
       </w:r>
     </w:p>
-    <w:bookmarkEnd w:id="39"/>
-    <w:bookmarkStart w:id="40" w:name="где-что-лежит-на-mac"/>
+    <w:bookmarkEnd w:id="47"/>
+    <w:bookmarkStart w:id="48" w:name="где-что-лежит-на-mac"/>
     <w:p>
       <w:pPr>
         <w:pStyle w:val="Heading2"/>
@@ -7118,8 +8819,8 @@
         </w:tc>
       </w:tr>
     </w:tbl>
-    <w:bookmarkEnd w:id="40"/>
-    <w:bookmarkStart w:id="41" w:name="X94cf89c78e24e327d41ec9aafbdbc0c655b42cb"/>
+    <w:bookmarkEnd w:id="48"/>
+    <w:bookmarkStart w:id="49" w:name="X94cf89c78e24e327d41ec9aafbdbc0c655b42cb"/>
     <w:p>
       <w:pPr>
         <w:pStyle w:val="Heading2"/>
@@ -7133,7 +8834,7 @@
         <w:pStyle w:val="Compact"/>
         <w:numPr>
           <w:ilvl w:val="0"/>
-          <w:numId w:val="1018"/>
+          <w:numId w:val="1019"/>
         </w:numPr>
       </w:pPr>
       <w:r>
@@ -7170,7 +8871,7 @@
         <w:pStyle w:val="Compact"/>
         <w:numPr>
           <w:ilvl w:val="0"/>
-          <w:numId w:val="1018"/>
+          <w:numId w:val="1019"/>
         </w:numPr>
       </w:pPr>
       <w:r>
@@ -7204,7 +8905,7 @@
         <w:pStyle w:val="Compact"/>
         <w:numPr>
           <w:ilvl w:val="0"/>
-          <w:numId w:val="1018"/>
+          <w:numId w:val="1019"/>
         </w:numPr>
       </w:pPr>
       <w:r>
@@ -7226,7 +8927,7 @@
         <w:pStyle w:val="Compact"/>
         <w:numPr>
           <w:ilvl w:val="0"/>
-          <w:numId w:val="1018"/>
+          <w:numId w:val="1019"/>
         </w:numPr>
       </w:pPr>
       <w:r>
@@ -7263,7 +8964,7 @@
         <w:pStyle w:val="Compact"/>
         <w:numPr>
           <w:ilvl w:val="0"/>
-          <w:numId w:val="1018"/>
+          <w:numId w:val="1019"/>
         </w:numPr>
       </w:pPr>
       <w:r>
@@ -7297,7 +8998,7 @@
         <w:pStyle w:val="Compact"/>
         <w:numPr>
           <w:ilvl w:val="0"/>
-          <w:numId w:val="1018"/>
+          <w:numId w:val="1019"/>
         </w:numPr>
       </w:pPr>
       <w:r>
@@ -7334,7 +9035,7 @@
         <w:pStyle w:val="Compact"/>
         <w:numPr>
           <w:ilvl w:val="0"/>
-          <w:numId w:val="1018"/>
+          <w:numId w:val="1019"/>
         </w:numPr>
       </w:pPr>
       <w:r>
@@ -7363,8 +9064,8 @@
         <w:t xml:space="preserve">.</w:t>
       </w:r>
     </w:p>
-    <w:bookmarkEnd w:id="41"/>
-    <w:bookmarkEnd w:id="42"/>
+    <w:bookmarkEnd w:id="49"/>
+    <w:bookmarkEnd w:id="50"/>
     <w:sectPr>
       <w:footnotePr>
         <w:numRestart w:val="eachSect"/>
@@ -7700,34 +9401,7 @@
     <w:abstractNumId w:val="991"/>
   </w:num>
   <w:num w:numId="1012">
-    <w:abstractNumId w:val="99411"/>
-    <w:lvlOverride w:ilvl="0">
-      <w:startOverride w:val="1"/>
-    </w:lvlOverride>
-    <w:lvlOverride w:ilvl="1">
-      <w:startOverride w:val="1"/>
-    </w:lvlOverride>
-    <w:lvlOverride w:ilvl="2">
-      <w:startOverride w:val="1"/>
-    </w:lvlOverride>
-    <w:lvlOverride w:ilvl="3">
-      <w:startOverride w:val="1"/>
-    </w:lvlOverride>
-    <w:lvlOverride w:ilvl="4">
-      <w:startOverride w:val="1"/>
-    </w:lvlOverride>
-    <w:lvlOverride w:ilvl="5">
-      <w:startOverride w:val="1"/>
-    </w:lvlOverride>
-    <w:lvlOverride w:ilvl="6">
-      <w:startOverride w:val="1"/>
-    </w:lvlOverride>
-    <w:lvlOverride w:ilvl="7">
-      <w:startOverride w:val="1"/>
-    </w:lvlOverride>
-    <w:lvlOverride w:ilvl="8">
-      <w:startOverride w:val="1"/>
-    </w:lvlOverride>
+    <w:abstractNumId w:val="991"/>
   </w:num>
   <w:num w:numId="1013">
     <w:abstractNumId w:val="991"/>
@@ -7766,12 +9440,42 @@
     <w:abstractNumId w:val="991"/>
   </w:num>
   <w:num w:numId="1016">
-    <w:abstractNumId w:val="991"/>
+    <w:abstractNumId w:val="99411"/>
+    <w:lvlOverride w:ilvl="0">
+      <w:startOverride w:val="1"/>
+    </w:lvlOverride>
+    <w:lvlOverride w:ilvl="1">
+      <w:startOverride w:val="1"/>
+    </w:lvlOverride>
+    <w:lvlOverride w:ilvl="2">
+      <w:startOverride w:val="1"/>
+    </w:lvlOverride>
+    <w:lvlOverride w:ilvl="3">
+      <w:startOverride w:val="1"/>
+    </w:lvlOverride>
+    <w:lvlOverride w:ilvl="4">
+      <w:startOverride w:val="1"/>
+    </w:lvlOverride>
+    <w:lvlOverride w:ilvl="5">
+      <w:startOverride w:val="1"/>
+    </w:lvlOverride>
+    <w:lvlOverride w:ilvl="6">
+      <w:startOverride w:val="1"/>
+    </w:lvlOverride>
+    <w:lvlOverride w:ilvl="7">
+      <w:startOverride w:val="1"/>
+    </w:lvlOverride>
+    <w:lvlOverride w:ilvl="8">
+      <w:startOverride w:val="1"/>
+    </w:lvlOverride>
   </w:num>
   <w:num w:numId="1017">
     <w:abstractNumId w:val="991"/>
   </w:num>
   <w:num w:numId="1018">
+    <w:abstractNumId w:val="991"/>
+  </w:num>
+  <w:num w:numId="1019">
     <w:abstractNumId w:val="991"/>
   </w:num>
 </w:numbering>

</xml_diff>